<commit_message>
Make final report monochrome with 16 references
</commit_message>
<xml_diff>
--- a/MemoryScape_Project_Report_Final.docx
+++ b/MemoryScape_Project_Report_Final.docx
@@ -11,7 +11,7 @@
         <w:rPr>
           <w:rFonts w:ascii="Arial" w:hAnsi="Arial"/>
           <w:b/>
-          <w:color w:val="7776D8"/>
+          <w:color w:val="000000"/>
           <w:sz w:val="30"/>
         </w:rPr>
         <w:t>BCSE497J  ·  PROJECT I</w:t>
@@ -26,7 +26,7 @@
         <w:rPr>
           <w:rFonts w:ascii="Arial" w:hAnsi="Arial"/>
           <w:b/>
-          <w:color w:val="17213B"/>
+          <w:color w:val="000000"/>
           <w:sz w:val="64"/>
         </w:rPr>
         <w:t>MEMORYSCAPE</w:t>
@@ -40,7 +40,7 @@
       <w:r>
         <w:rPr>
           <w:rFonts w:ascii="Arial" w:hAnsi="Arial"/>
-          <w:color w:val="242B3B"/>
+          <w:color w:val="000000"/>
           <w:sz w:val="36"/>
         </w:rPr>
         <w:t>A Spatiotemporal Personal Knowledge Graph</w:t>
@@ -61,7 +61,7 @@
         <w:tc>
           <w:tcPr>
             <w:tcW w:type="dxa" w:w="9544"/>
-            <w:shd w:fill="17213B"/>
+            <w:shd w:fill="000000"/>
             <w:tcMar>
               <w:top w:w="220" w:type="dxa"/>
               <w:start w:w="250" w:type="dxa"/>
@@ -107,7 +107,7 @@
         <w:rPr>
           <w:rFonts w:ascii="Arial" w:hAnsi="Arial"/>
           <w:b/>
-          <w:color w:val="17213B"/>
+          <w:color w:val="000000"/>
           <w:sz w:val="26"/>
         </w:rPr>
         <w:t>Akil  ·  25BCE2777</w:t>
@@ -122,7 +122,7 @@
         <w:rPr>
           <w:rFonts w:ascii="Arial" w:hAnsi="Arial"/>
           <w:b/>
-          <w:color w:val="17213B"/>
+          <w:color w:val="000000"/>
           <w:sz w:val="26"/>
         </w:rPr>
         <w:t>Syon Vijae Thyvalappil  ·  25BCE2598</w:t>
@@ -136,7 +136,7 @@
       <w:r>
         <w:rPr>
           <w:rFonts w:ascii="Arial" w:hAnsi="Arial"/>
-          <w:color w:val="596579"/>
+          <w:color w:val="000000"/>
           <w:sz w:val="21"/>
         </w:rPr>
         <w:t>School of Computer Science and Engineering</w:t>
@@ -145,7 +145,7 @@
       <w:r>
         <w:rPr>
           <w:rFonts w:ascii="Arial" w:hAnsi="Arial"/>
-          <w:color w:val="596579"/>
+          <w:color w:val="000000"/>
           <w:sz w:val="21"/>
         </w:rPr>
         <w:t>Vellore Institute of Technology, Vellore</w:t>
@@ -154,7 +154,7 @@
       <w:r>
         <w:rPr>
           <w:rFonts w:ascii="Arial" w:hAnsi="Arial"/>
-          <w:color w:val="596579"/>
+          <w:color w:val="000000"/>
           <w:sz w:val="21"/>
         </w:rPr>
         <w:t>October 2026</w:t>
@@ -177,7 +177,7 @@
     </w:p>
     <w:p>
       <w:r>
-        <w:t>MemoryScape is a local-first personal knowledge system that stores episodes together with event time, geographic position, reusable contexts, and directed associations. Its research focus is to make three recall mechanisms inspectable as database operations: route-based spatial retrieval using PostGIS, temporal strength decay with transactional reinforcement, and explainable associative spreading activation using recursive SQL. The web interface also supports everyday capture, searchable memory management, a current-location-aware spatiotemporal route query, a timeline, a force-directed graph, fading-memory review, and a one-card-at-a-time weekly review. PostgreSQL 16, PostGIS, and pg_cron perform the core retrieval, strength updates, and scheduled view maintenance; no embedding model, vector database, or external AI service is required. Validation includes deterministic database fixtures, a 1,200-memory synthetic dataset, a larger five-trial performance comparison at 10,000 and 50,000 records, 75 unit/application tests, and 15 targeted browser/integration tests for the current graph and map changes. In the measured broad-route workload, a controlled sequential plan was faster than the spatial-index candidate, while a materialized fading-memory lookup was much faster than its direct-query comparison. These findings are workload-specific. They establish neither a general index speedup nor human recall benefit, biological validity, or usability; no participant study has been conducted. [1–7, 11–16]</w:t>
+        <w:t>MemoryScape is a local-first personal knowledge system that stores episodes together with event time, geographic position, reusable contexts, and directed associations. Its research focus is to make three recall mechanisms inspectable as database operations: route-based spatial retrieval using PostGIS, temporal strength decay with transactional reinforcement, and explainable associative spreading activation using recursive SQL. The web interface also supports everyday capture, searchable memory management, a current-location-aware spatiotemporal route query, a timeline, a force-directed graph, fading-memory review, and a one-card-at-a-time weekly review. PostgreSQL 16, PostGIS, and pg_cron perform the core retrieval, strength updates, and scheduled view maintenance; no embedding model, vector database, or external AI service is required. Validation includes deterministic database fixtures, a 1,200-memory synthetic dataset, a larger five-trial performance comparison at 10,000 and 50,000 records, 75 unit/application tests, and 15 targeted browser/integration tests for the current graph and map changes. In the measured broad-route workload, a controlled sequential plan was faster than the spatial-index candidate, while a materialized fading-memory lookup was much faster than its direct-query comparison. These findings are workload-specific. They establish neither a general index speedup nor human recall benefit, biological validity, or usability; no participant study has been conducted. [1–8, 9–16]</w:t>
       </w:r>
     </w:p>
     <w:p>
@@ -206,7 +206,13 @@
         <w:tc>
           <w:tcPr>
             <w:tcW w:type="dxa" w:w="9544"/>
-            <w:shd w:fill="EAF5F9"/>
+            <w:shd w:fill="FFFFFF"/>
+            <w:tcBorders>
+              <w:top w:val="single" w:sz="8" w:color="000000"/>
+              <w:left w:val="single" w:sz="8" w:color="000000"/>
+              <w:bottom w:val="single" w:sz="8" w:color="000000"/>
+              <w:right w:val="single" w:sz="8" w:color="000000"/>
+            </w:tcBorders>
             <w:tcMar>
               <w:top w:w="160" w:type="dxa"/>
               <w:start w:w="190" w:type="dxa"/>
@@ -221,7 +227,7 @@
             <w:r>
               <w:rPr>
                 <w:b/>
-                <w:color w:val="17213B"/>
+                <w:color w:val="000000"/>
               </w:rPr>
               <w:t xml:space="preserve">Evidence boundary  </w:t>
             </w:r>
@@ -269,7 +275,7 @@
         <w:tc>
           <w:tcPr>
             <w:tcW w:type="dxa" w:w="3384"/>
-            <w:shd w:fill="17213B"/>
+            <w:shd w:fill="000000"/>
             <w:tcMar>
               <w:top w:w="90" w:type="dxa"/>
               <w:start w:w="110" w:type="dxa"/>
@@ -296,7 +302,7 @@
         <w:tc>
           <w:tcPr>
             <w:tcW w:type="dxa" w:w="4968"/>
-            <w:shd w:fill="17213B"/>
+            <w:shd w:fill="000000"/>
             <w:tcMar>
               <w:top w:w="90" w:type="dxa"/>
               <w:start w:w="110" w:type="dxa"/>
@@ -323,7 +329,7 @@
         <w:tc>
           <w:tcPr>
             <w:tcW w:type="dxa" w:w="792"/>
-            <w:shd w:fill="17213B"/>
+            <w:shd w:fill="000000"/>
             <w:tcMar>
               <w:top w:w="90" w:type="dxa"/>
               <w:start w:w="110" w:type="dxa"/>
@@ -359,7 +365,7 @@
               <w:bottom w:w="90" w:type="dxa"/>
               <w:end w:w="110" w:type="dxa"/>
             </w:tcMar>
-            <w:shd w:fill="F5F6FA"/>
+            <w:shd w:fill="FFFFFF"/>
           </w:tcPr>
           <w:p>
             <w:pPr>
@@ -368,7 +374,7 @@
             <w:r>
               <w:rPr>
                 <w:rFonts w:ascii="Arial" w:hAnsi="Arial"/>
-                <w:color w:val="242B3B"/>
+                <w:color w:val="000000"/>
                 <w:sz w:val="18"/>
               </w:rPr>
               <w:t>Abstract</w:t>
@@ -385,7 +391,7 @@
               <w:bottom w:w="90" w:type="dxa"/>
               <w:end w:w="110" w:type="dxa"/>
             </w:tcMar>
-            <w:shd w:fill="F5F6FA"/>
+            <w:shd w:fill="FFFFFF"/>
           </w:tcPr>
           <w:p>
             <w:pPr>
@@ -394,7 +400,7 @@
             <w:r>
               <w:rPr>
                 <w:rFonts w:ascii="Arial" w:hAnsi="Arial"/>
-                <w:color w:val="242B3B"/>
+                <w:color w:val="000000"/>
                 <w:sz w:val="18"/>
               </w:rPr>
               <w:t>Summary and evidence boundary</w:t>
@@ -411,7 +417,7 @@
               <w:bottom w:w="90" w:type="dxa"/>
               <w:end w:w="110" w:type="dxa"/>
             </w:tcMar>
-            <w:shd w:fill="F5F6FA"/>
+            <w:shd w:fill="FFFFFF"/>
           </w:tcPr>
           <w:p>
             <w:pPr>
@@ -420,7 +426,7 @@
             <w:r>
               <w:rPr>
                 <w:rFonts w:ascii="Arial" w:hAnsi="Arial"/>
-                <w:color w:val="242B3B"/>
+                <w:color w:val="000000"/>
                 <w:sz w:val="18"/>
               </w:rPr>
               <w:t>2</w:t>
@@ -439,6 +445,7 @@
               <w:bottom w:w="90" w:type="dxa"/>
               <w:end w:w="110" w:type="dxa"/>
             </w:tcMar>
+            <w:shd w:fill="FFFFFF"/>
           </w:tcPr>
           <w:p>
             <w:pPr>
@@ -447,7 +454,7 @@
             <w:r>
               <w:rPr>
                 <w:rFonts w:ascii="Arial" w:hAnsi="Arial"/>
-                <w:color w:val="242B3B"/>
+                <w:color w:val="000000"/>
                 <w:sz w:val="18"/>
               </w:rPr>
               <w:t>1. Introduction</w:t>
@@ -464,6 +471,7 @@
               <w:bottom w:w="90" w:type="dxa"/>
               <w:end w:w="110" w:type="dxa"/>
             </w:tcMar>
+            <w:shd w:fill="FFFFFF"/>
           </w:tcPr>
           <w:p>
             <w:pPr>
@@ -472,7 +480,7 @@
             <w:r>
               <w:rPr>
                 <w:rFonts w:ascii="Arial" w:hAnsi="Arial"/>
-                <w:color w:val="242B3B"/>
+                <w:color w:val="000000"/>
                 <w:sz w:val="18"/>
               </w:rPr>
               <w:t>Problem, scope, contribution</w:t>
@@ -489,6 +497,7 @@
               <w:bottom w:w="90" w:type="dxa"/>
               <w:end w:w="110" w:type="dxa"/>
             </w:tcMar>
+            <w:shd w:fill="FFFFFF"/>
           </w:tcPr>
           <w:p>
             <w:pPr>
@@ -497,7 +506,7 @@
             <w:r>
               <w:rPr>
                 <w:rFonts w:ascii="Arial" w:hAnsi="Arial"/>
-                <w:color w:val="242B3B"/>
+                <w:color w:val="000000"/>
                 <w:sz w:val="18"/>
               </w:rPr>
               <w:t>4</w:t>
@@ -516,7 +525,7 @@
               <w:bottom w:w="90" w:type="dxa"/>
               <w:end w:w="110" w:type="dxa"/>
             </w:tcMar>
-            <w:shd w:fill="F5F6FA"/>
+            <w:shd w:fill="FFFFFF"/>
           </w:tcPr>
           <w:p>
             <w:pPr>
@@ -525,7 +534,7 @@
             <w:r>
               <w:rPr>
                 <w:rFonts w:ascii="Arial" w:hAnsi="Arial"/>
-                <w:color w:val="242B3B"/>
+                <w:color w:val="000000"/>
                 <w:sz w:val="18"/>
               </w:rPr>
               <w:t>2. Literature Study</w:t>
@@ -542,7 +551,7 @@
               <w:bottom w:w="90" w:type="dxa"/>
               <w:end w:w="110" w:type="dxa"/>
             </w:tcMar>
-            <w:shd w:fill="F5F6FA"/>
+            <w:shd w:fill="FFFFFF"/>
           </w:tcPr>
           <w:p>
             <w:pPr>
@@ -551,7 +560,7 @@
             <w:r>
               <w:rPr>
                 <w:rFonts w:ascii="Arial" w:hAnsi="Arial"/>
-                <w:color w:val="242B3B"/>
+                <w:color w:val="000000"/>
                 <w:sz w:val="18"/>
               </w:rPr>
               <w:t>Memory cues, spatial context, association, forgetting</w:t>
@@ -568,7 +577,7 @@
               <w:bottom w:w="90" w:type="dxa"/>
               <w:end w:w="110" w:type="dxa"/>
             </w:tcMar>
-            <w:shd w:fill="F5F6FA"/>
+            <w:shd w:fill="FFFFFF"/>
           </w:tcPr>
           <w:p>
             <w:pPr>
@@ -577,7 +586,7 @@
             <w:r>
               <w:rPr>
                 <w:rFonts w:ascii="Arial" w:hAnsi="Arial"/>
-                <w:color w:val="242B3B"/>
+                <w:color w:val="000000"/>
                 <w:sz w:val="18"/>
               </w:rPr>
               <w:t>5</w:t>
@@ -596,6 +605,7 @@
               <w:bottom w:w="90" w:type="dxa"/>
               <w:end w:w="110" w:type="dxa"/>
             </w:tcMar>
+            <w:shd w:fill="FFFFFF"/>
           </w:tcPr>
           <w:p>
             <w:pPr>
@@ -604,7 +614,7 @@
             <w:r>
               <w:rPr>
                 <w:rFonts w:ascii="Arial" w:hAnsi="Arial"/>
-                <w:color w:val="242B3B"/>
+                <w:color w:val="000000"/>
                 <w:sz w:val="18"/>
               </w:rPr>
               <w:t>3. Objectives</w:t>
@@ -621,6 +631,7 @@
               <w:bottom w:w="90" w:type="dxa"/>
               <w:end w:w="110" w:type="dxa"/>
             </w:tcMar>
+            <w:shd w:fill="FFFFFF"/>
           </w:tcPr>
           <w:p>
             <w:pPr>
@@ -629,7 +640,7 @@
             <w:r>
               <w:rPr>
                 <w:rFonts w:ascii="Arial" w:hAnsi="Arial"/>
-                <w:color w:val="242B3B"/>
+                <w:color w:val="000000"/>
                 <w:sz w:val="18"/>
               </w:rPr>
               <w:t>Research questions and measurable objectives</w:t>
@@ -646,6 +657,7 @@
               <w:bottom w:w="90" w:type="dxa"/>
               <w:end w:w="110" w:type="dxa"/>
             </w:tcMar>
+            <w:shd w:fill="FFFFFF"/>
           </w:tcPr>
           <w:p>
             <w:pPr>
@@ -654,7 +666,7 @@
             <w:r>
               <w:rPr>
                 <w:rFonts w:ascii="Arial" w:hAnsi="Arial"/>
-                <w:color w:val="242B3B"/>
+                <w:color w:val="000000"/>
                 <w:sz w:val="18"/>
               </w:rPr>
               <w:t>6</w:t>
@@ -673,7 +685,7 @@
               <w:bottom w:w="90" w:type="dxa"/>
               <w:end w:w="110" w:type="dxa"/>
             </w:tcMar>
-            <w:shd w:fill="F5F6FA"/>
+            <w:shd w:fill="FFFFFF"/>
           </w:tcPr>
           <w:p>
             <w:pPr>
@@ -682,7 +694,7 @@
             <w:r>
               <w:rPr>
                 <w:rFonts w:ascii="Arial" w:hAnsi="Arial"/>
-                <w:color w:val="242B3B"/>
+                <w:color w:val="000000"/>
                 <w:sz w:val="18"/>
               </w:rPr>
               <w:t>4. Design</w:t>
@@ -699,7 +711,7 @@
               <w:bottom w:w="90" w:type="dxa"/>
               <w:end w:w="110" w:type="dxa"/>
             </w:tcMar>
-            <w:shd w:fill="F5F6FA"/>
+            <w:shd w:fill="FFFFFF"/>
           </w:tcPr>
           <w:p>
             <w:pPr>
@@ -708,7 +720,7 @@
             <w:r>
               <w:rPr>
                 <w:rFonts w:ascii="Arial" w:hAnsi="Arial"/>
-                <w:color w:val="242B3B"/>
+                <w:color w:val="000000"/>
                 <w:sz w:val="18"/>
               </w:rPr>
               <w:t>Architecture, schema, and three recall engines</w:t>
@@ -725,7 +737,7 @@
               <w:bottom w:w="90" w:type="dxa"/>
               <w:end w:w="110" w:type="dxa"/>
             </w:tcMar>
-            <w:shd w:fill="F5F6FA"/>
+            <w:shd w:fill="FFFFFF"/>
           </w:tcPr>
           <w:p>
             <w:pPr>
@@ -734,7 +746,7 @@
             <w:r>
               <w:rPr>
                 <w:rFonts w:ascii="Arial" w:hAnsi="Arial"/>
-                <w:color w:val="242B3B"/>
+                <w:color w:val="000000"/>
                 <w:sz w:val="18"/>
               </w:rPr>
               <w:t>7</w:t>
@@ -753,6 +765,7 @@
               <w:bottom w:w="90" w:type="dxa"/>
               <w:end w:w="110" w:type="dxa"/>
             </w:tcMar>
+            <w:shd w:fill="FFFFFF"/>
           </w:tcPr>
           <w:p>
             <w:pPr>
@@ -761,7 +774,7 @@
             <w:r>
               <w:rPr>
                 <w:rFonts w:ascii="Arial" w:hAnsi="Arial"/>
-                <w:color w:val="242B3B"/>
+                <w:color w:val="000000"/>
                 <w:sz w:val="18"/>
               </w:rPr>
               <w:t>5. Implementation and Evaluation</w:t>
@@ -778,6 +791,7 @@
               <w:bottom w:w="90" w:type="dxa"/>
               <w:end w:w="110" w:type="dxa"/>
             </w:tcMar>
+            <w:shd w:fill="FFFFFF"/>
           </w:tcPr>
           <w:p>
             <w:pPr>
@@ -786,7 +800,7 @@
             <w:r>
               <w:rPr>
                 <w:rFonts w:ascii="Arial" w:hAnsi="Arial"/>
-                <w:color w:val="242B3B"/>
+                <w:color w:val="000000"/>
                 <w:sz w:val="18"/>
               </w:rPr>
               <w:t>Features, data, validation, measurements, limitations</w:t>
@@ -803,6 +817,7 @@
               <w:bottom w:w="90" w:type="dxa"/>
               <w:end w:w="110" w:type="dxa"/>
             </w:tcMar>
+            <w:shd w:fill="FFFFFF"/>
           </w:tcPr>
           <w:p>
             <w:pPr>
@@ -811,7 +826,7 @@
             <w:r>
               <w:rPr>
                 <w:rFonts w:ascii="Arial" w:hAnsi="Arial"/>
-                <w:color w:val="242B3B"/>
+                <w:color w:val="000000"/>
                 <w:sz w:val="18"/>
               </w:rPr>
               <w:t>9</w:t>
@@ -830,7 +845,7 @@
               <w:bottom w:w="90" w:type="dxa"/>
               <w:end w:w="110" w:type="dxa"/>
             </w:tcMar>
-            <w:shd w:fill="F5F6FA"/>
+            <w:shd w:fill="FFFFFF"/>
           </w:tcPr>
           <w:p>
             <w:pPr>
@@ -839,7 +854,7 @@
             <w:r>
               <w:rPr>
                 <w:rFonts w:ascii="Arial" w:hAnsi="Arial"/>
-                <w:color w:val="242B3B"/>
+                <w:color w:val="000000"/>
                 <w:sz w:val="18"/>
               </w:rPr>
               <w:t>6. Conclusion and Future Work</w:t>
@@ -856,7 +871,7 @@
               <w:bottom w:w="90" w:type="dxa"/>
               <w:end w:w="110" w:type="dxa"/>
             </w:tcMar>
-            <w:shd w:fill="F5F6FA"/>
+            <w:shd w:fill="FFFFFF"/>
           </w:tcPr>
           <w:p>
             <w:pPr>
@@ -865,7 +880,7 @@
             <w:r>
               <w:rPr>
                 <w:rFonts w:ascii="Arial" w:hAnsi="Arial"/>
-                <w:color w:val="242B3B"/>
+                <w:color w:val="000000"/>
                 <w:sz w:val="18"/>
               </w:rPr>
               <w:t>Findings and next research steps</w:t>
@@ -882,7 +897,7 @@
               <w:bottom w:w="90" w:type="dxa"/>
               <w:end w:w="110" w:type="dxa"/>
             </w:tcMar>
-            <w:shd w:fill="F5F6FA"/>
+            <w:shd w:fill="FFFFFF"/>
           </w:tcPr>
           <w:p>
             <w:pPr>
@@ -891,7 +906,7 @@
             <w:r>
               <w:rPr>
                 <w:rFonts w:ascii="Arial" w:hAnsi="Arial"/>
-                <w:color w:val="242B3B"/>
+                <w:color w:val="000000"/>
                 <w:sz w:val="18"/>
               </w:rPr>
               <w:t>12</w:t>
@@ -910,6 +925,7 @@
               <w:bottom w:w="90" w:type="dxa"/>
               <w:end w:w="110" w:type="dxa"/>
             </w:tcMar>
+            <w:shd w:fill="FFFFFF"/>
           </w:tcPr>
           <w:p>
             <w:pPr>
@@ -918,7 +934,7 @@
             <w:r>
               <w:rPr>
                 <w:rFonts w:ascii="Arial" w:hAnsi="Arial"/>
-                <w:color w:val="242B3B"/>
+                <w:color w:val="000000"/>
                 <w:sz w:val="18"/>
               </w:rPr>
               <w:t>References</w:t>
@@ -935,6 +951,7 @@
               <w:bottom w:w="90" w:type="dxa"/>
               <w:end w:w="110" w:type="dxa"/>
             </w:tcMar>
+            <w:shd w:fill="FFFFFF"/>
           </w:tcPr>
           <w:p>
             <w:pPr>
@@ -943,7 +960,7 @@
             <w:r>
               <w:rPr>
                 <w:rFonts w:ascii="Arial" w:hAnsi="Arial"/>
-                <w:color w:val="242B3B"/>
+                <w:color w:val="000000"/>
                 <w:sz w:val="18"/>
               </w:rPr>
               <w:t>Research literature and primary technical documentation</w:t>
@@ -960,6 +977,7 @@
               <w:bottom w:w="90" w:type="dxa"/>
               <w:end w:w="110" w:type="dxa"/>
             </w:tcMar>
+            <w:shd w:fill="FFFFFF"/>
           </w:tcPr>
           <w:p>
             <w:pPr>
@@ -968,7 +986,7 @@
             <w:r>
               <w:rPr>
                 <w:rFonts w:ascii="Arial" w:hAnsi="Arial"/>
-                <w:color w:val="242B3B"/>
+                <w:color w:val="000000"/>
                 <w:sz w:val="18"/>
               </w:rPr>
               <w:t>13</w:t>
@@ -1013,7 +1031,7 @@
     </w:p>
     <w:p>
       <w:r>
-        <w:t>A personal episode is more than a text fragment: it happens at a time and place, involves people or activities, and may become a cue for remembering other episodes. Research on episodic memory emphasizes recollection of events situated in subjective time, while retrieval-cue theory explains why context present at encoding can affect later access [1, 2]. Personal-information retrieval research connects memory lapses to difficulty refinding saved information [19], and lifelogging reviews describe the challenge of organizing heterogeneous personal records for later retrieval [21]. A conventional note list can preserve prose but often leaves these relations implicit. MemoryScape makes time, location, context, and association explicit so they can be queried and explained with database operations.</w:t>
+        <w:t>A personal episode is more than a text fragment: it happens at a time and place, involves people or activities, and may become a cue for remembering other episodes. Research on episodic memory emphasizes recollection of events situated in subjective time, while retrieval-cue theory explains why context present at encoding can affect later access [1, 2]. Personal-information retrieval research connects memory lapses to difficulty refinding saved information [10], and lifelogging reviews describe the challenge of organizing heterogeneous personal records for later retrieval [12]. A conventional note list can preserve prose but often leaves these relations implicit. MemoryScape makes time, location, context, and association explicit so they can be queried and explained with database operations.</w:t>
       </w:r>
     </w:p>
     <w:p>
@@ -1027,7 +1045,7 @@
     </w:p>
     <w:p>
       <w:r>
-        <w:t>This is a local-first software research prototype for an individual workspace. The term ‘biologically inspired’ describes analogies used to organize recall—contextual cues, fading strength, reinforcement, and association. It does not assert that PostgreSQL functions reproduce neural processes. The prototype deliberately excludes machine learning, semantic embeddings, vector stores, LLM retrieval, and paid APIs. Map tiles may be fetched from a configured OpenStreetMap-compatible tile source; memory content and algorithmic processing remain local. Lifelog design literature also cautions against assuming that total capture alone produces useful recall and stresses the importance of selective, accessible cues [18, 21, 22]. [11–16]</w:t>
+        <w:t>This is a local-first software research prototype for an individual workspace. The term ‘biologically inspired’ describes analogies used to organize recall—contextual cues, fading strength, reinforcement, and association. It does not assert that PostgreSQL functions reproduce neural processes. The prototype deliberately excludes machine learning, semantic embeddings, vector stores, LLM retrieval, and paid APIs. Map tiles may be fetched from a configured OpenStreetMap-compatible tile source; memory content and algorithmic processing remain local. Lifelog design literature also cautions against assuming that total capture alone produces useful recall and stresses the importance of selective, accessible cues [9, 12, 13]. Technical mechanisms are documented in the database and spatial references [14–16].</w:t>
       </w:r>
     </w:p>
     <w:p>
@@ -1162,7 +1180,7 @@
     </w:p>
     <w:p>
       <w:r>
-        <w:t>Tulving’s account distinguishes episodic recollection of personally experienced events from general semantic knowledge [1]. Encoding-specificity work emphasizes that effective retrieval cues depend on the relation between learning context and the cue at test [2]. Personal information management research has examined how memory lapses affect refinding saved information and how retrieval tools can support that task [19]. Lifelogging research adds an important product-design caveat: more capture is not automatically more useful, and interaction cost affects whether people use digital records [18, 21]. MemoryScape operationalizes a narrow engineering analogue: event time, place, and named contexts are first-class fields and can be supplied as explicit query constraints or displayed beside a recalled episode. The implementation does not infer which cue would be psychologically effective.</w:t>
+        <w:t>Tulving’s account distinguishes episodic recollection of personally experienced events from general semantic knowledge [1]. Encoding-specificity work emphasizes that effective retrieval cues depend on the relation between learning context and the cue at test [2]. Personal information management research has examined how memory lapses affect refinding saved information and how retrieval tools can support that task [10]. Lifelogging research adds an important product-design caveat: more capture is not automatically more useful, and interaction cost affects whether people use digital records [9, 12]. MemoryScape operationalizes a narrow engineering analogue: event time, place, and named contexts are first-class fields and can be supplied as explicit query constraints or displayed beside a recalled episode. The implementation does not infer which cue would be psychologically effective.</w:t>
       </w:r>
     </w:p>
     <w:p>
@@ -1176,7 +1194,7 @@
     </w:p>
     <w:p>
       <w:r>
-        <w:t>Tolman introduced the cognitive-map concept to discuss spatially organized learning [3]. Autobiographical-memory models also describe hierarchies of lifetime periods, general events, and event-specific knowledge [4]. Temporal-context models explain recency and contiguity through evolving contextual states, rather than treating elapsed time as the only cause of recall changes [5]. Prior work has explicitly paired map and timeline views to make location histories easier to reminisce about [20], while a 2022 review describes location, time, and other lifelog modalities as complementary retrieval context [21]. These works motivate storing spatial and temporal context together; MemoryScape’s route corridor and event-time interval remain deterministic database queries, not implementations of those cognitive theories.</w:t>
+        <w:t>Tolman introduced the cognitive-map concept to discuss spatially organized learning [3]. Autobiographical-memory models also describe hierarchies of lifetime periods, general events, and event-specific knowledge [4]. Temporal-context models explain recency and contiguity through evolving contextual states, rather than treating elapsed time as the only cause of recall changes [5]. Prior work has explicitly paired map and timeline views to make location histories easier to reminisce about [11], while a 2022 review describes location, time, and other lifelog modalities as complementary retrieval context [12]. These works motivate storing spatial and temporal context together; MemoryScape’s route corridor and event-time interval remain deterministic database queries, not implementations of those cognitive theories.</w:t>
       </w:r>
     </w:p>
     <w:p>
@@ -1218,7 +1236,7 @@
     </w:p>
     <w:p>
       <w:r>
-        <w:t>The technical choices align with documented database mechanisms: PostgreSQL recursive WITH queries support iterative traversal and path tracking [9]; GiST is a generalized index framework with workload-dependent behavior [10]; PostGIS geography predicates express distances in meters and can use available indexes [11]; and PostgreSQL materialized views persist query results for later refresh [12, 13]. pg_cron schedules SQL work inside PostgreSQL [14]. Recent lifelog application-design work emphasizes explicit relationships between personal data, technology, and intended user criteria [22]. MemoryScape’s contribution is an integrated, explainable application of these mechanisms to a personal-memory workflow, not a claim to invent these primitives.</w:t>
+        <w:t>The technical choices align with documented database mechanisms: PostgreSQL recursive WITH queries, index types, transaction isolation, and materialized views provide the database primitives used here [14]; PostGIS geography predicates express distances in meters, support index-aware filtering, and provide along-line location [15]. pg_cron schedules SQL work inside PostgreSQL [16]. Recent lifelog application-design work emphasizes explicit relationships between personal data, technology, and intended user criteria [13]. MemoryScape’s contribution is an integrated, explainable application of these mechanisms to a personal-memory workflow, not a claim to invent these primitives.</w:t>
       </w:r>
     </w:p>
     <w:p>
@@ -1356,7 +1374,7 @@
         <w:tc>
           <w:tcPr>
             <w:tcW w:type="dxa" w:w="2160"/>
-            <w:shd w:fill="17213B"/>
+            <w:shd w:fill="000000"/>
             <w:tcMar>
               <w:top w:w="90" w:type="dxa"/>
               <w:start w:w="110" w:type="dxa"/>
@@ -1383,7 +1401,7 @@
         <w:tc>
           <w:tcPr>
             <w:tcW w:type="dxa" w:w="7056"/>
-            <w:shd w:fill="17213B"/>
+            <w:shd w:fill="000000"/>
             <w:tcMar>
               <w:top w:w="90" w:type="dxa"/>
               <w:start w:w="110" w:type="dxa"/>
@@ -1419,7 +1437,7 @@
               <w:bottom w:w="90" w:type="dxa"/>
               <w:end w:w="110" w:type="dxa"/>
             </w:tcMar>
-            <w:shd w:fill="F5F6FA"/>
+            <w:shd w:fill="FFFFFF"/>
           </w:tcPr>
           <w:p>
             <w:pPr>
@@ -1428,7 +1446,7 @@
             <w:r>
               <w:rPr>
                 <w:rFonts w:ascii="Arial" w:hAnsi="Arial"/>
-                <w:color w:val="242B3B"/>
+                <w:color w:val="000000"/>
                 <w:sz w:val="18"/>
               </w:rPr>
               <w:t>RQ1 · Spatial</w:t>
@@ -1445,7 +1463,7 @@
               <w:bottom w:w="90" w:type="dxa"/>
               <w:end w:w="110" w:type="dxa"/>
             </w:tcMar>
-            <w:shd w:fill="F5F6FA"/>
+            <w:shd w:fill="FFFFFF"/>
           </w:tcPr>
           <w:p>
             <w:pPr>
@@ -1454,7 +1472,7 @@
             <w:r>
               <w:rPr>
                 <w:rFonts w:ascii="Arial" w:hAnsi="Arial"/>
-                <w:color w:val="242B3B"/>
+                <w:color w:val="000000"/>
                 <w:sz w:val="18"/>
               </w:rPr>
               <w:t>Does PostGIS retrieve points near a user route in meters and order them along that route?</w:t>
@@ -1473,6 +1491,7 @@
               <w:bottom w:w="90" w:type="dxa"/>
               <w:end w:w="110" w:type="dxa"/>
             </w:tcMar>
+            <w:shd w:fill="FFFFFF"/>
           </w:tcPr>
           <w:p>
             <w:pPr>
@@ -1481,7 +1500,7 @@
             <w:r>
               <w:rPr>
                 <w:rFonts w:ascii="Arial" w:hAnsi="Arial"/>
-                <w:color w:val="242B3B"/>
+                <w:color w:val="000000"/>
                 <w:sz w:val="18"/>
               </w:rPr>
               <w:t>RQ2 · Temporal</w:t>
@@ -1498,6 +1517,7 @@
               <w:bottom w:w="90" w:type="dxa"/>
               <w:end w:w="110" w:type="dxa"/>
             </w:tcMar>
+            <w:shd w:fill="FFFFFF"/>
           </w:tcPr>
           <w:p>
             <w:pPr>
@@ -1506,7 +1526,7 @@
             <w:r>
               <w:rPr>
                 <w:rFonts w:ascii="Arial" w:hAnsi="Arial"/>
-                <w:color w:val="242B3B"/>
+                <w:color w:val="000000"/>
                 <w:sz w:val="18"/>
               </w:rPr>
               <w:t>Do decay and reinforcement update strength and timestamps atomically, with reinforcement history?</w:t>
@@ -1525,7 +1545,7 @@
               <w:bottom w:w="90" w:type="dxa"/>
               <w:end w:w="110" w:type="dxa"/>
             </w:tcMar>
-            <w:shd w:fill="F5F6FA"/>
+            <w:shd w:fill="FFFFFF"/>
           </w:tcPr>
           <w:p>
             <w:pPr>
@@ -1534,7 +1554,7 @@
             <w:r>
               <w:rPr>
                 <w:rFonts w:ascii="Arial" w:hAnsi="Arial"/>
-                <w:color w:val="242B3B"/>
+                <w:color w:val="000000"/>
                 <w:sz w:val="18"/>
               </w:rPr>
               <w:t>RQ3 · Associative</w:t>
@@ -1551,7 +1571,7 @@
               <w:bottom w:w="90" w:type="dxa"/>
               <w:end w:w="110" w:type="dxa"/>
             </w:tcMar>
-            <w:shd w:fill="F5F6FA"/>
+            <w:shd w:fill="FFFFFF"/>
           </w:tcPr>
           <w:p>
             <w:pPr>
@@ -1560,7 +1580,7 @@
             <w:r>
               <w:rPr>
                 <w:rFonts w:ascii="Arial" w:hAnsi="Arial"/>
-                <w:color w:val="242B3B"/>
+                <w:color w:val="000000"/>
                 <w:sz w:val="18"/>
               </w:rPr>
               <w:t>Can recursive SQL return cycle-safe, bounded, threshold-pruned paths with deterministic scores?</w:t>
@@ -1579,6 +1599,7 @@
               <w:bottom w:w="90" w:type="dxa"/>
               <w:end w:w="110" w:type="dxa"/>
             </w:tcMar>
+            <w:shd w:fill="FFFFFF"/>
           </w:tcPr>
           <w:p>
             <w:pPr>
@@ -1587,7 +1608,7 @@
             <w:r>
               <w:rPr>
                 <w:rFonts w:ascii="Arial" w:hAnsi="Arial"/>
-                <w:color w:val="242B3B"/>
+                <w:color w:val="000000"/>
                 <w:sz w:val="18"/>
               </w:rPr>
               <w:t>RQ4 · Performance</w:t>
@@ -1604,6 +1625,7 @@
               <w:bottom w:w="90" w:type="dxa"/>
               <w:end w:w="110" w:type="dxa"/>
             </w:tcMar>
+            <w:shd w:fill="FFFFFF"/>
           </w:tcPr>
           <w:p>
             <w:pPr>
@@ -1612,7 +1634,7 @@
             <w:r>
               <w:rPr>
                 <w:rFonts w:ascii="Arial" w:hAnsi="Arial"/>
-                <w:color w:val="242B3B"/>
+                <w:color w:val="000000"/>
                 <w:sz w:val="18"/>
               </w:rPr>
               <w:t>How do query plans and observed runtimes vary by dataset size, selectivity, depth, and threshold?</w:t>
@@ -1631,7 +1653,7 @@
               <w:bottom w:w="90" w:type="dxa"/>
               <w:end w:w="110" w:type="dxa"/>
             </w:tcMar>
-            <w:shd w:fill="F5F6FA"/>
+            <w:shd w:fill="FFFFFF"/>
           </w:tcPr>
           <w:p>
             <w:pPr>
@@ -1640,7 +1662,7 @@
             <w:r>
               <w:rPr>
                 <w:rFonts w:ascii="Arial" w:hAnsi="Arial"/>
-                <w:color w:val="242B3B"/>
+                <w:color w:val="000000"/>
                 <w:sz w:val="18"/>
               </w:rPr>
               <w:t>RQ5 · Review</w:t>
@@ -1657,7 +1679,7 @@
               <w:bottom w:w="90" w:type="dxa"/>
               <w:end w:w="110" w:type="dxa"/>
             </w:tcMar>
-            <w:shd w:fill="F5F6FA"/>
+            <w:shd w:fill="FFFFFF"/>
           </w:tcPr>
           <w:p>
             <w:pPr>
@@ -1666,7 +1688,7 @@
             <w:r>
               <w:rPr>
                 <w:rFonts w:ascii="Arial" w:hAnsi="Arial"/>
-                <w:color w:val="242B3B"/>
+                <w:color w:val="000000"/>
                 <w:sz w:val="18"/>
               </w:rPr>
               <w:t>How does a materialized fading-memory queue compare with the equivalent direct query, including refresh cost?</w:t>
@@ -1849,7 +1871,7 @@
     </w:p>
     <w:p>
       <w:r>
-        <w:t>A map route is validated as a non-degenerate LineString and submitted as GeoJSON. SQL constructs a route geography and applies ST_DWithin to memory geography using a radius in meters; PostGIS documents this geography overload in meters and describes the index-aware bounding-box stage [11]. Distance is returned for explanation. ST_LineLocatePoint gives each result a fractional position along the route, followed by stable tie-breaks [12]. The spatiotemporal operation adds a half-open event interval: from ≤ occurred_at &lt; until. Both the spatial corridor and interval are evaluated in the database.</w:t>
+        <w:t>A map route is validated as a non-degenerate LineString and submitted as GeoJSON. SQL constructs a route geography and applies ST_DWithin to memory geography using a radius in meters; PostGIS documents this geography overload in meters and describes the index-aware bounding-box stage [15]. Distance is returned for explanation. ST_LineLocatePoint gives each result a fractional position along the route, followed by stable tie-breaks [15]. The spatiotemporal operation adds a half-open event interval: from ≤ occurred_at &lt; until. Both the spatial corridor and interval are evaluated in the database.</w:t>
       </w:r>
     </w:p>
     <w:p>
@@ -1882,7 +1904,7 @@
     </w:p>
     <w:p>
       <w:r>
-        <w:t>For a seed activation A₀, each recursive step is A_next=A_current×edge_weight×(β₀+β₁|valence|)×target_strength. The default salience values are β₀=0.75 and β₁=0.25; settings expose the coefficients. Both positive and negative signed valence can provide a salient cue, while the original sign remains available for explanation. The recursive CTE carries node and edge arrays, rejects a node already in the current path, enforces a threshold within recursion, and stops at the requested hop depth (maximum 32). Multiple paths to the same memory are ranked deterministically, with the strongest valid path returned as the explanation [6, 9].</w:t>
+        <w:t>For a seed activation A₀, each recursive step is A_next=A_current×edge_weight×(β₀+β₁|valence|)×target_strength. The default salience values are β₀=0.75 and β₁=0.25; settings expose the coefficients. Both positive and negative signed valence can provide a salient cue, while the original sign remains available for explanation. The recursive CTE carries node and edge arrays, rejects a node already in the current path, enforces a threshold within recursion, and stops at the requested hop depth (maximum 32). Multiple paths to the same memory are ranked deterministically, with the strongest valid path returned as the explanation [6, 14].</w:t>
       </w:r>
     </w:p>
     <w:p>
@@ -1896,7 +1918,7 @@
     </w:p>
     <w:p>
       <w:r>
-        <w:t>A PostgreSQL materialized view stores fading-memory candidates and a deterministic review priority; pg_cron refreshes it hourly while decay runs daily [12–14]. The interface shows the view's refresh time because its data is a scheduled snapshot. Weekly Review displays one card at a time: swipe right keeps it, swipe left archives it recoverably, and explicit Keep/Snooze/Archive/Dismiss controls provide accessible alternatives. Sensitive and archived memories are excluded from review queues.</w:t>
+        <w:t>A PostgreSQL materialized view stores fading-memory candidates and a deterministic review priority; pg_cron refreshes it hourly while decay runs daily [14, 16]. The interface shows the view's refresh time because its data is a scheduled snapshot. Weekly Review displays one card at a time: swipe right keeps it, swipe left archives it recoverably, and explicit Keep/Snooze/Archive/Dismiss controls provide accessible alternatives. Sensitive and archived memories are excluded from review queues.</w:t>
       </w:r>
     </w:p>
     <w:p>
@@ -1941,7 +1963,7 @@
         <w:tc>
           <w:tcPr>
             <w:tcW w:type="dxa" w:w="2016"/>
-            <w:shd w:fill="17213B"/>
+            <w:shd w:fill="000000"/>
             <w:tcMar>
               <w:top w:w="90" w:type="dxa"/>
               <w:start w:w="110" w:type="dxa"/>
@@ -1968,7 +1990,7 @@
         <w:tc>
           <w:tcPr>
             <w:tcW w:type="dxa" w:w="7200"/>
-            <w:shd w:fill="17213B"/>
+            <w:shd w:fill="000000"/>
             <w:tcMar>
               <w:top w:w="90" w:type="dxa"/>
               <w:start w:w="110" w:type="dxa"/>
@@ -2004,7 +2026,7 @@
               <w:bottom w:w="90" w:type="dxa"/>
               <w:end w:w="110" w:type="dxa"/>
             </w:tcMar>
-            <w:shd w:fill="F5F6FA"/>
+            <w:shd w:fill="FFFFFF"/>
           </w:tcPr>
           <w:p>
             <w:pPr>
@@ -2013,7 +2035,7 @@
             <w:r>
               <w:rPr>
                 <w:rFonts w:ascii="Arial" w:hAnsi="Arial"/>
-                <w:color w:val="242B3B"/>
+                <w:color w:val="000000"/>
                 <w:sz w:val="17"/>
               </w:rPr>
               <w:t>Database</w:t>
@@ -2030,7 +2052,7 @@
               <w:bottom w:w="90" w:type="dxa"/>
               <w:end w:w="110" w:type="dxa"/>
             </w:tcMar>
-            <w:shd w:fill="F5F6FA"/>
+            <w:shd w:fill="FFFFFF"/>
           </w:tcPr>
           <w:p>
             <w:pPr>
@@ -2039,7 +2061,7 @@
             <w:r>
               <w:rPr>
                 <w:rFonts w:ascii="Arial" w:hAnsi="Arial"/>
-                <w:color w:val="242B3B"/>
+                <w:color w:val="000000"/>
                 <w:sz w:val="17"/>
               </w:rPr>
               <w:t>PostgreSQL 16; PostGIS geography; pg_cron; SQL migrations, constraints, GiST/B-tree indexes, functions, recursive CTEs, transactions, and materialized views.</w:t>
@@ -2058,6 +2080,7 @@
               <w:bottom w:w="90" w:type="dxa"/>
               <w:end w:w="110" w:type="dxa"/>
             </w:tcMar>
+            <w:shd w:fill="FFFFFF"/>
           </w:tcPr>
           <w:p>
             <w:pPr>
@@ -2066,7 +2089,7 @@
             <w:r>
               <w:rPr>
                 <w:rFonts w:ascii="Arial" w:hAnsi="Arial"/>
-                <w:color w:val="242B3B"/>
+                <w:color w:val="000000"/>
                 <w:sz w:val="17"/>
               </w:rPr>
               <w:t>API</w:t>
@@ -2083,6 +2106,7 @@
               <w:bottom w:w="90" w:type="dxa"/>
               <w:end w:w="110" w:type="dxa"/>
             </w:tcMar>
+            <w:shd w:fill="FFFFFF"/>
           </w:tcPr>
           <w:p>
             <w:pPr>
@@ -2091,7 +2115,7 @@
             <w:r>
               <w:rPr>
                 <w:rFonts w:ascii="Arial" w:hAnsi="Arial"/>
-                <w:color w:val="242B3B"/>
+                <w:color w:val="000000"/>
                 <w:sz w:val="17"/>
               </w:rPr>
               <w:t>Node.js and TypeScript, node-postgres, runtime validation, parameterized queries, and transaction boundaries.</w:t>
@@ -2110,7 +2134,7 @@
               <w:bottom w:w="90" w:type="dxa"/>
               <w:end w:w="110" w:type="dxa"/>
             </w:tcMar>
-            <w:shd w:fill="F5F6FA"/>
+            <w:shd w:fill="FFFFFF"/>
           </w:tcPr>
           <w:p>
             <w:pPr>
@@ -2119,7 +2143,7 @@
             <w:r>
               <w:rPr>
                 <w:rFonts w:ascii="Arial" w:hAnsi="Arial"/>
-                <w:color w:val="242B3B"/>
+                <w:color w:val="000000"/>
                 <w:sz w:val="17"/>
               </w:rPr>
               <w:t>Web application</w:t>
@@ -2136,7 +2160,7 @@
               <w:bottom w:w="90" w:type="dxa"/>
               <w:end w:w="110" w:type="dxa"/>
             </w:tcMar>
-            <w:shd w:fill="F5F6FA"/>
+            <w:shd w:fill="FFFFFF"/>
           </w:tcPr>
           <w:p>
             <w:pPr>
@@ -2145,7 +2169,7 @@
             <w:r>
               <w:rPr>
                 <w:rFonts w:ascii="Arial" w:hAnsi="Arial"/>
-                <w:color w:val="242B3B"/>
+                <w:color w:val="000000"/>
                 <w:sz w:val="17"/>
               </w:rPr>
               <w:t>Next.js 16, React 19, Tailwind CSS 4; Leaflet maps; Cytoscape force-directed associative graph; timeline and review interfaces.</w:t>
@@ -2164,6 +2188,7 @@
               <w:bottom w:w="90" w:type="dxa"/>
               <w:end w:w="110" w:type="dxa"/>
             </w:tcMar>
+            <w:shd w:fill="FFFFFF"/>
           </w:tcPr>
           <w:p>
             <w:pPr>
@@ -2172,7 +2197,7 @@
             <w:r>
               <w:rPr>
                 <w:rFonts w:ascii="Arial" w:hAnsi="Arial"/>
-                <w:color w:val="242B3B"/>
+                <w:color w:val="000000"/>
                 <w:sz w:val="17"/>
               </w:rPr>
               <w:t>Evaluation</w:t>
@@ -2189,6 +2214,7 @@
               <w:bottom w:w="90" w:type="dxa"/>
               <w:end w:w="110" w:type="dxa"/>
             </w:tcMar>
+            <w:shd w:fill="FFFFFF"/>
           </w:tcPr>
           <w:p>
             <w:pPr>
@@ -2197,7 +2223,7 @@
             <w:r>
               <w:rPr>
                 <w:rFonts w:ascii="Arial" w:hAnsi="Arial"/>
-                <w:color w:val="242B3B"/>
+                <w:color w:val="000000"/>
                 <w:sz w:val="17"/>
               </w:rPr>
               <w:t>Vitest, PostgreSQL SQL contract tests, concurrency checks, Playwright workflows, EXPLAIN ANALYZE runners, and deterministic synthetic generators.</w:t>
@@ -2340,7 +2366,7 @@
         <w:tc>
           <w:tcPr>
             <w:tcW w:type="dxa" w:w="2664"/>
-            <w:shd w:fill="17213B"/>
+            <w:shd w:fill="000000"/>
             <w:tcMar>
               <w:top w:w="90" w:type="dxa"/>
               <w:start w:w="110" w:type="dxa"/>
@@ -2367,7 +2393,7 @@
         <w:tc>
           <w:tcPr>
             <w:tcW w:type="dxa" w:w="6552"/>
-            <w:shd w:fill="17213B"/>
+            <w:shd w:fill="000000"/>
             <w:tcMar>
               <w:top w:w="90" w:type="dxa"/>
               <w:start w:w="110" w:type="dxa"/>
@@ -2403,7 +2429,7 @@
               <w:bottom w:w="90" w:type="dxa"/>
               <w:end w:w="110" w:type="dxa"/>
             </w:tcMar>
-            <w:shd w:fill="F5F6FA"/>
+            <w:shd w:fill="FFFFFF"/>
           </w:tcPr>
           <w:p>
             <w:pPr>
@@ -2412,7 +2438,7 @@
             <w:r>
               <w:rPr>
                 <w:rFonts w:ascii="Arial" w:hAnsi="Arial"/>
-                <w:color w:val="242B3B"/>
+                <w:color w:val="000000"/>
                 <w:sz w:val="17"/>
               </w:rPr>
               <w:t>Unit/application suite</w:t>
@@ -2429,7 +2455,7 @@
               <w:bottom w:w="90" w:type="dxa"/>
               <w:end w:w="110" w:type="dxa"/>
             </w:tcMar>
-            <w:shd w:fill="F5F6FA"/>
+            <w:shd w:fill="FFFFFF"/>
           </w:tcPr>
           <w:p>
             <w:pPr>
@@ -2438,7 +2464,7 @@
             <w:r>
               <w:rPr>
                 <w:rFonts w:ascii="Arial" w:hAnsi="Arial"/>
-                <w:color w:val="242B3B"/>
+                <w:color w:val="000000"/>
                 <w:sz w:val="17"/>
               </w:rPr>
               <w:t>75 Vitest tests passed across 19 files.</w:t>
@@ -2457,6 +2483,7 @@
               <w:bottom w:w="90" w:type="dxa"/>
               <w:end w:w="110" w:type="dxa"/>
             </w:tcMar>
+            <w:shd w:fill="FFFFFF"/>
           </w:tcPr>
           <w:p>
             <w:pPr>
@@ -2465,7 +2492,7 @@
             <w:r>
               <w:rPr>
                 <w:rFonts w:ascii="Arial" w:hAnsi="Arial"/>
-                <w:color w:val="242B3B"/>
+                <w:color w:val="000000"/>
                 <w:sz w:val="17"/>
               </w:rPr>
               <w:t>Current graph/map integration</w:t>
@@ -2482,6 +2509,7 @@
               <w:bottom w:w="90" w:type="dxa"/>
               <w:end w:w="110" w:type="dxa"/>
             </w:tcMar>
+            <w:shd w:fill="FFFFFF"/>
           </w:tcPr>
           <w:p>
             <w:pPr>
@@ -2490,7 +2518,7 @@
             <w:r>
               <w:rPr>
                 <w:rFonts w:ascii="Arial" w:hAnsi="Arial"/>
-                <w:color w:val="242B3B"/>
+                <w:color w:val="000000"/>
                 <w:sz w:val="17"/>
               </w:rPr>
               <w:t>15 Playwright tests passed, including four-hop SQL/API traversal, custom hop input, map centering, location route start, reinforcement, and spatiotemporal route workflow.</w:t>
@@ -2509,7 +2537,7 @@
               <w:bottom w:w="90" w:type="dxa"/>
               <w:end w:w="110" w:type="dxa"/>
             </w:tcMar>
-            <w:shd w:fill="F5F6FA"/>
+            <w:shd w:fill="FFFFFF"/>
           </w:tcPr>
           <w:p>
             <w:pPr>
@@ -2518,7 +2546,7 @@
             <w:r>
               <w:rPr>
                 <w:rFonts w:ascii="Arial" w:hAnsi="Arial"/>
-                <w:color w:val="242B3B"/>
+                <w:color w:val="000000"/>
                 <w:sz w:val="17"/>
               </w:rPr>
               <w:t>Type and service checks</w:t>
@@ -2535,7 +2563,7 @@
               <w:bottom w:w="90" w:type="dxa"/>
               <w:end w:w="110" w:type="dxa"/>
             </w:tcMar>
-            <w:shd w:fill="F5F6FA"/>
+            <w:shd w:fill="FFFFFF"/>
           </w:tcPr>
           <w:p>
             <w:pPr>
@@ -2544,7 +2572,7 @@
             <w:r>
               <w:rPr>
                 <w:rFonts w:ascii="Arial" w:hAnsi="Arial"/>
-                <w:color w:val="242B3B"/>
+                <w:color w:val="000000"/>
                 <w:sz w:val="17"/>
               </w:rPr>
               <w:t>TypeScript no-emit check passed; Docker web image started; health endpoint reported PostgreSQL 16.15 and PostGIS 3.6.4.</w:t>
@@ -2563,6 +2591,7 @@
               <w:bottom w:w="90" w:type="dxa"/>
               <w:end w:w="110" w:type="dxa"/>
             </w:tcMar>
+            <w:shd w:fill="FFFFFF"/>
           </w:tcPr>
           <w:p>
             <w:pPr>
@@ -2571,7 +2600,7 @@
             <w:r>
               <w:rPr>
                 <w:rFonts w:ascii="Arial" w:hAnsi="Arial"/>
-                <w:color w:val="242B3B"/>
+                <w:color w:val="000000"/>
                 <w:sz w:val="17"/>
               </w:rPr>
               <w:t>Database migration</w:t>
@@ -2588,6 +2617,7 @@
               <w:bottom w:w="90" w:type="dxa"/>
               <w:end w:w="110" w:type="dxa"/>
             </w:tcMar>
+            <w:shd w:fill="FFFFFF"/>
           </w:tcPr>
           <w:p>
             <w:pPr>
@@ -2596,7 +2626,7 @@
             <w:r>
               <w:rPr>
                 <w:rFonts w:ascii="Arial" w:hAnsi="Arial"/>
-                <w:color w:val="242B3B"/>
+                <w:color w:val="000000"/>
                 <w:sz w:val="17"/>
               </w:rPr>
               <w:t>015_associative_depth.sql applied and recorded in schema_migrations; it raises recursive recall's validated maximum depth to 32.</w:t>
@@ -2615,7 +2645,7 @@
               <w:bottom w:w="90" w:type="dxa"/>
               <w:end w:w="110" w:type="dxa"/>
             </w:tcMar>
-            <w:shd w:fill="F5F6FA"/>
+            <w:shd w:fill="FFFFFF"/>
           </w:tcPr>
           <w:p>
             <w:pPr>
@@ -2624,7 +2654,7 @@
             <w:r>
               <w:rPr>
                 <w:rFonts w:ascii="Arial" w:hAnsi="Arial"/>
-                <w:color w:val="242B3B"/>
+                <w:color w:val="000000"/>
                 <w:sz w:val="17"/>
               </w:rPr>
               <w:t>Research SQL fixture</w:t>
@@ -2641,7 +2671,7 @@
               <w:bottom w:w="90" w:type="dxa"/>
               <w:end w:w="110" w:type="dxa"/>
             </w:tcMar>
-            <w:shd w:fill="F5F6FA"/>
+            <w:shd w:fill="FFFFFF"/>
           </w:tcPr>
           <w:p>
             <w:pPr>
@@ -2650,7 +2680,7 @@
             <w:r>
               <w:rPr>
                 <w:rFonts w:ascii="Arial" w:hAnsi="Arial"/>
-                <w:color w:val="242B3B"/>
+                <w:color w:val="000000"/>
                 <w:sz w:val="17"/>
               </w:rPr>
               <w:t>Synthetic eight-memory baseline: precision 0.833, recall 1.000, F1 0.909, MRR 1.000; not participant outcomes.</w:t>
@@ -2673,7 +2703,7 @@
     </w:p>
     <w:p>
       <w:r>
-        <w:t>The scale comparison runs five sequential trials for each synthetic size (10,000 and 50,000 memories). Each observation follows a PostgreSQL restart, which resets shared_buffers, but the protocol does not flush operating-system cache. Data is generated from clustered campus distributions. Values below are observed medians from this host and this workload; they are not cold-disk latency, an independent-machine sample, or a general service-level expectation. [10–14]</w:t>
+        <w:t>The scale comparison runs five sequential trials for each synthetic size (10,000 and 50,000 memories). Each observation follows a PostgreSQL restart, which resets shared_buffers, but the protocol does not flush operating-system cache. Data is generated from clustered campus distributions. Values below are observed medians from this host and this workload; they are not cold-disk latency, an independent-machine sample, or a general service-level expectation. [14–16]</w:t>
       </w:r>
     </w:p>
     <w:p>
@@ -2748,7 +2778,7 @@
         <w:tc>
           <w:tcPr>
             <w:tcW w:type="dxa" w:w="4896"/>
-            <w:shd w:fill="17213B"/>
+            <w:shd w:fill="000000"/>
             <w:tcMar>
               <w:top w:w="90" w:type="dxa"/>
               <w:start w:w="110" w:type="dxa"/>
@@ -2775,7 +2805,7 @@
         <w:tc>
           <w:tcPr>
             <w:tcW w:type="dxa" w:w="2160"/>
-            <w:shd w:fill="17213B"/>
+            <w:shd w:fill="000000"/>
             <w:tcMar>
               <w:top w:w="90" w:type="dxa"/>
               <w:start w:w="110" w:type="dxa"/>
@@ -2802,7 +2832,7 @@
         <w:tc>
           <w:tcPr>
             <w:tcW w:type="dxa" w:w="2160"/>
-            <w:shd w:fill="17213B"/>
+            <w:shd w:fill="000000"/>
             <w:tcMar>
               <w:top w:w="90" w:type="dxa"/>
               <w:start w:w="110" w:type="dxa"/>
@@ -2838,7 +2868,7 @@
               <w:bottom w:w="90" w:type="dxa"/>
               <w:end w:w="110" w:type="dxa"/>
             </w:tcMar>
-            <w:shd w:fill="F5F6FA"/>
+            <w:shd w:fill="FFFFFF"/>
           </w:tcPr>
           <w:p>
             <w:pPr>
@@ -2847,7 +2877,7 @@
             <w:r>
               <w:rPr>
                 <w:rFonts w:ascii="Arial" w:hAnsi="Arial"/>
-                <w:color w:val="242B3B"/>
+                <w:color w:val="000000"/>
                 <w:sz w:val="17"/>
               </w:rPr>
               <w:t>Spatial index candidate</w:t>
@@ -2864,7 +2894,7 @@
               <w:bottom w:w="90" w:type="dxa"/>
               <w:end w:w="110" w:type="dxa"/>
             </w:tcMar>
-            <w:shd w:fill="F5F6FA"/>
+            <w:shd w:fill="FFFFFF"/>
           </w:tcPr>
           <w:p>
             <w:pPr>
@@ -2873,7 +2903,7 @@
             <w:r>
               <w:rPr>
                 <w:rFonts w:ascii="Arial" w:hAnsi="Arial"/>
-                <w:color w:val="242B3B"/>
+                <w:color w:val="000000"/>
                 <w:sz w:val="17"/>
               </w:rPr>
               <w:t>57.510</w:t>
@@ -2890,7 +2920,7 @@
               <w:bottom w:w="90" w:type="dxa"/>
               <w:end w:w="110" w:type="dxa"/>
             </w:tcMar>
-            <w:shd w:fill="F5F6FA"/>
+            <w:shd w:fill="FFFFFF"/>
           </w:tcPr>
           <w:p>
             <w:pPr>
@@ -2899,7 +2929,7 @@
             <w:r>
               <w:rPr>
                 <w:rFonts w:ascii="Arial" w:hAnsi="Arial"/>
-                <w:color w:val="242B3B"/>
+                <w:color w:val="000000"/>
                 <w:sz w:val="17"/>
               </w:rPr>
               <w:t>58.784</w:t>
@@ -2918,6 +2948,7 @@
               <w:bottom w:w="90" w:type="dxa"/>
               <w:end w:w="110" w:type="dxa"/>
             </w:tcMar>
+            <w:shd w:fill="FFFFFF"/>
           </w:tcPr>
           <w:p>
             <w:pPr>
@@ -2926,7 +2957,7 @@
             <w:r>
               <w:rPr>
                 <w:rFonts w:ascii="Arial" w:hAnsi="Arial"/>
-                <w:color w:val="242B3B"/>
+                <w:color w:val="000000"/>
                 <w:sz w:val="17"/>
               </w:rPr>
               <w:t>Controlled sequential plan</w:t>
@@ -2943,6 +2974,7 @@
               <w:bottom w:w="90" w:type="dxa"/>
               <w:end w:w="110" w:type="dxa"/>
             </w:tcMar>
+            <w:shd w:fill="FFFFFF"/>
           </w:tcPr>
           <w:p>
             <w:pPr>
@@ -2951,7 +2983,7 @@
             <w:r>
               <w:rPr>
                 <w:rFonts w:ascii="Arial" w:hAnsi="Arial"/>
-                <w:color w:val="242B3B"/>
+                <w:color w:val="000000"/>
                 <w:sz w:val="17"/>
               </w:rPr>
               <w:t>25.203</w:t>
@@ -2968,6 +3000,7 @@
               <w:bottom w:w="90" w:type="dxa"/>
               <w:end w:w="110" w:type="dxa"/>
             </w:tcMar>
+            <w:shd w:fill="FFFFFF"/>
           </w:tcPr>
           <w:p>
             <w:pPr>
@@ -2976,7 +3009,7 @@
             <w:r>
               <w:rPr>
                 <w:rFonts w:ascii="Arial" w:hAnsi="Arial"/>
-                <w:color w:val="242B3B"/>
+                <w:color w:val="000000"/>
                 <w:sz w:val="17"/>
               </w:rPr>
               <w:t>49.212</w:t>
@@ -2995,7 +3028,7 @@
               <w:bottom w:w="90" w:type="dxa"/>
               <w:end w:w="110" w:type="dxa"/>
             </w:tcMar>
-            <w:shd w:fill="F5F6FA"/>
+            <w:shd w:fill="FFFFFF"/>
           </w:tcPr>
           <w:p>
             <w:pPr>
@@ -3004,7 +3037,7 @@
             <w:r>
               <w:rPr>
                 <w:rFonts w:ascii="Arial" w:hAnsi="Arial"/>
-                <w:color w:val="242B3B"/>
+                <w:color w:val="000000"/>
                 <w:sz w:val="17"/>
               </w:rPr>
               <w:t>Associative recall · depth 1</w:t>
@@ -3021,7 +3054,7 @@
               <w:bottom w:w="90" w:type="dxa"/>
               <w:end w:w="110" w:type="dxa"/>
             </w:tcMar>
-            <w:shd w:fill="F5F6FA"/>
+            <w:shd w:fill="FFFFFF"/>
           </w:tcPr>
           <w:p>
             <w:pPr>
@@ -3030,7 +3063,7 @@
             <w:r>
               <w:rPr>
                 <w:rFonts w:ascii="Arial" w:hAnsi="Arial"/>
-                <w:color w:val="242B3B"/>
+                <w:color w:val="000000"/>
                 <w:sz w:val="17"/>
               </w:rPr>
               <w:t>0.405</w:t>
@@ -3047,7 +3080,7 @@
               <w:bottom w:w="90" w:type="dxa"/>
               <w:end w:w="110" w:type="dxa"/>
             </w:tcMar>
-            <w:shd w:fill="F5F6FA"/>
+            <w:shd w:fill="FFFFFF"/>
           </w:tcPr>
           <w:p>
             <w:pPr>
@@ -3056,7 +3089,7 @@
             <w:r>
               <w:rPr>
                 <w:rFonts w:ascii="Arial" w:hAnsi="Arial"/>
-                <w:color w:val="242B3B"/>
+                <w:color w:val="000000"/>
                 <w:sz w:val="17"/>
               </w:rPr>
               <w:t>0.190</w:t>
@@ -3075,6 +3108,7 @@
               <w:bottom w:w="90" w:type="dxa"/>
               <w:end w:w="110" w:type="dxa"/>
             </w:tcMar>
+            <w:shd w:fill="FFFFFF"/>
           </w:tcPr>
           <w:p>
             <w:pPr>
@@ -3083,7 +3117,7 @@
             <w:r>
               <w:rPr>
                 <w:rFonts w:ascii="Arial" w:hAnsi="Arial"/>
-                <w:color w:val="242B3B"/>
+                <w:color w:val="000000"/>
                 <w:sz w:val="17"/>
               </w:rPr>
               <w:t>Associative recall · depth 2</w:t>
@@ -3100,6 +3134,7 @@
               <w:bottom w:w="90" w:type="dxa"/>
               <w:end w:w="110" w:type="dxa"/>
             </w:tcMar>
+            <w:shd w:fill="FFFFFF"/>
           </w:tcPr>
           <w:p>
             <w:pPr>
@@ -3108,7 +3143,7 @@
             <w:r>
               <w:rPr>
                 <w:rFonts w:ascii="Arial" w:hAnsi="Arial"/>
-                <w:color w:val="242B3B"/>
+                <w:color w:val="000000"/>
                 <w:sz w:val="17"/>
               </w:rPr>
               <w:t>0.303</w:t>
@@ -3125,6 +3160,7 @@
               <w:bottom w:w="90" w:type="dxa"/>
               <w:end w:w="110" w:type="dxa"/>
             </w:tcMar>
+            <w:shd w:fill="FFFFFF"/>
           </w:tcPr>
           <w:p>
             <w:pPr>
@@ -3133,7 +3169,7 @@
             <w:r>
               <w:rPr>
                 <w:rFonts w:ascii="Arial" w:hAnsi="Arial"/>
-                <w:color w:val="242B3B"/>
+                <w:color w:val="000000"/>
                 <w:sz w:val="17"/>
               </w:rPr>
               <w:t>0.166</w:t>
@@ -3152,7 +3188,7 @@
               <w:bottom w:w="90" w:type="dxa"/>
               <w:end w:w="110" w:type="dxa"/>
             </w:tcMar>
-            <w:shd w:fill="F5F6FA"/>
+            <w:shd w:fill="FFFFFF"/>
           </w:tcPr>
           <w:p>
             <w:pPr>
@@ -3161,7 +3197,7 @@
             <w:r>
               <w:rPr>
                 <w:rFonts w:ascii="Arial" w:hAnsi="Arial"/>
-                <w:color w:val="242B3B"/>
+                <w:color w:val="000000"/>
                 <w:sz w:val="17"/>
               </w:rPr>
               <w:t>Associative recall · depth 3</w:t>
@@ -3178,7 +3214,7 @@
               <w:bottom w:w="90" w:type="dxa"/>
               <w:end w:w="110" w:type="dxa"/>
             </w:tcMar>
-            <w:shd w:fill="F5F6FA"/>
+            <w:shd w:fill="FFFFFF"/>
           </w:tcPr>
           <w:p>
             <w:pPr>
@@ -3187,7 +3223,7 @@
             <w:r>
               <w:rPr>
                 <w:rFonts w:ascii="Arial" w:hAnsi="Arial"/>
-                <w:color w:val="242B3B"/>
+                <w:color w:val="000000"/>
                 <w:sz w:val="17"/>
               </w:rPr>
               <w:t>0.445</w:t>
@@ -3204,7 +3240,7 @@
               <w:bottom w:w="90" w:type="dxa"/>
               <w:end w:w="110" w:type="dxa"/>
             </w:tcMar>
-            <w:shd w:fill="F5F6FA"/>
+            <w:shd w:fill="FFFFFF"/>
           </w:tcPr>
           <w:p>
             <w:pPr>
@@ -3213,7 +3249,7 @@
             <w:r>
               <w:rPr>
                 <w:rFonts w:ascii="Arial" w:hAnsi="Arial"/>
-                <w:color w:val="242B3B"/>
+                <w:color w:val="000000"/>
                 <w:sz w:val="17"/>
               </w:rPr>
               <w:t>0.198</w:t>
@@ -3232,6 +3268,7 @@
               <w:bottom w:w="90" w:type="dxa"/>
               <w:end w:w="110" w:type="dxa"/>
             </w:tcMar>
+            <w:shd w:fill="FFFFFF"/>
           </w:tcPr>
           <w:p>
             <w:pPr>
@@ -3240,7 +3277,7 @@
             <w:r>
               <w:rPr>
                 <w:rFonts w:ascii="Arial" w:hAnsi="Arial"/>
-                <w:color w:val="242B3B"/>
+                <w:color w:val="000000"/>
                 <w:sz w:val="17"/>
               </w:rPr>
               <w:t>Fading-memory materialized view</w:t>
@@ -3257,6 +3294,7 @@
               <w:bottom w:w="90" w:type="dxa"/>
               <w:end w:w="110" w:type="dxa"/>
             </w:tcMar>
+            <w:shd w:fill="FFFFFF"/>
           </w:tcPr>
           <w:p>
             <w:pPr>
@@ -3265,7 +3303,7 @@
             <w:r>
               <w:rPr>
                 <w:rFonts w:ascii="Arial" w:hAnsi="Arial"/>
-                <w:color w:val="242B3B"/>
+                <w:color w:val="000000"/>
                 <w:sz w:val="17"/>
               </w:rPr>
               <w:t>3.531</w:t>
@@ -3282,6 +3320,7 @@
               <w:bottom w:w="90" w:type="dxa"/>
               <w:end w:w="110" w:type="dxa"/>
             </w:tcMar>
+            <w:shd w:fill="FFFFFF"/>
           </w:tcPr>
           <w:p>
             <w:pPr>
@@ -3290,7 +3329,7 @@
             <w:r>
               <w:rPr>
                 <w:rFonts w:ascii="Arial" w:hAnsi="Arial"/>
-                <w:color w:val="242B3B"/>
+                <w:color w:val="000000"/>
                 <w:sz w:val="17"/>
               </w:rPr>
               <w:t>7.493</w:t>
@@ -3309,7 +3348,7 @@
               <w:bottom w:w="90" w:type="dxa"/>
               <w:end w:w="110" w:type="dxa"/>
             </w:tcMar>
-            <w:shd w:fill="F5F6FA"/>
+            <w:shd w:fill="FFFFFF"/>
           </w:tcPr>
           <w:p>
             <w:pPr>
@@ -3318,7 +3357,7 @@
             <w:r>
               <w:rPr>
                 <w:rFonts w:ascii="Arial" w:hAnsi="Arial"/>
-                <w:color w:val="242B3B"/>
+                <w:color w:val="000000"/>
                 <w:sz w:val="17"/>
               </w:rPr>
               <w:t>Equivalent direct fading query</w:t>
@@ -3335,7 +3374,7 @@
               <w:bottom w:w="90" w:type="dxa"/>
               <w:end w:w="110" w:type="dxa"/>
             </w:tcMar>
-            <w:shd w:fill="F5F6FA"/>
+            <w:shd w:fill="FFFFFF"/>
           </w:tcPr>
           <w:p>
             <w:pPr>
@@ -3344,7 +3383,7 @@
             <w:r>
               <w:rPr>
                 <w:rFonts w:ascii="Arial" w:hAnsi="Arial"/>
-                <w:color w:val="242B3B"/>
+                <w:color w:val="000000"/>
                 <w:sz w:val="17"/>
               </w:rPr>
               <w:t>198.339</w:t>
@@ -3361,7 +3400,7 @@
               <w:bottom w:w="90" w:type="dxa"/>
               <w:end w:w="110" w:type="dxa"/>
             </w:tcMar>
-            <w:shd w:fill="F5F6FA"/>
+            <w:shd w:fill="FFFFFF"/>
           </w:tcPr>
           <w:p>
             <w:pPr>
@@ -3370,7 +3409,7 @@
             <w:r>
               <w:rPr>
                 <w:rFonts w:ascii="Arial" w:hAnsi="Arial"/>
-                <w:color w:val="242B3B"/>
+                <w:color w:val="000000"/>
                 <w:sz w:val="17"/>
               </w:rPr>
               <w:t>205.908</w:t>
@@ -3389,6 +3428,7 @@
               <w:bottom w:w="90" w:type="dxa"/>
               <w:end w:w="110" w:type="dxa"/>
             </w:tcMar>
+            <w:shd w:fill="FFFFFF"/>
           </w:tcPr>
           <w:p>
             <w:pPr>
@@ -3397,7 +3437,7 @@
             <w:r>
               <w:rPr>
                 <w:rFonts w:ascii="Arial" w:hAnsi="Arial"/>
-                <w:color w:val="242B3B"/>
+                <w:color w:val="000000"/>
                 <w:sz w:val="17"/>
               </w:rPr>
               <w:t>Timeline query</w:t>
@@ -3414,6 +3454,7 @@
               <w:bottom w:w="90" w:type="dxa"/>
               <w:end w:w="110" w:type="dxa"/>
             </w:tcMar>
+            <w:shd w:fill="FFFFFF"/>
           </w:tcPr>
           <w:p>
             <w:pPr>
@@ -3422,7 +3463,7 @@
             <w:r>
               <w:rPr>
                 <w:rFonts w:ascii="Arial" w:hAnsi="Arial"/>
-                <w:color w:val="242B3B"/>
+                <w:color w:val="000000"/>
                 <w:sz w:val="17"/>
               </w:rPr>
               <w:t>0.132</w:t>
@@ -3439,6 +3480,7 @@
               <w:bottom w:w="90" w:type="dxa"/>
               <w:end w:w="110" w:type="dxa"/>
             </w:tcMar>
+            <w:shd w:fill="FFFFFF"/>
           </w:tcPr>
           <w:p>
             <w:pPr>
@@ -3447,7 +3489,7 @@
             <w:r>
               <w:rPr>
                 <w:rFonts w:ascii="Arial" w:hAnsi="Arial"/>
-                <w:color w:val="242B3B"/>
+                <w:color w:val="000000"/>
                 <w:sz w:val="17"/>
               </w:rPr>
               <w:t>0.091</w:t>
@@ -3754,7 +3796,13 @@
         <w:tc>
           <w:tcPr>
             <w:tcW w:type="dxa" w:w="9544"/>
-            <w:shd w:fill="F1F3FA"/>
+            <w:shd w:fill="FFFFFF"/>
+            <w:tcBorders>
+              <w:top w:val="single" w:sz="8" w:color="000000"/>
+              <w:left w:val="single" w:sz="8" w:color="000000"/>
+              <w:bottom w:val="single" w:sz="8" w:color="000000"/>
+              <w:right w:val="single" w:sz="8" w:color="000000"/>
+            </w:tcBorders>
             <w:tcMar>
               <w:top w:w="160" w:type="dxa"/>
               <w:start w:w="190" w:type="dxa"/>
@@ -3769,7 +3817,7 @@
             <w:r>
               <w:rPr>
                 <w:b/>
-                <w:color w:val="17213B"/>
+                <w:color w:val="000000"/>
               </w:rPr>
               <w:t xml:space="preserve">Project conclusion  </w:t>
             </w:r>
@@ -3812,7 +3860,7 @@
       <w:hyperlink r:id="rId21">
         <w:r>
           <w:rPr>
-            <w:color w:val="51A6C8"/>
+            <w:color w:val="000000"/>
             <w:u w:val="single"/>
           </w:rPr>
           <w:t>[source]</w:t>
@@ -3834,7 +3882,7 @@
       <w:hyperlink r:id="rId22">
         <w:r>
           <w:rPr>
-            <w:color w:val="51A6C8"/>
+            <w:color w:val="000000"/>
             <w:u w:val="single"/>
           </w:rPr>
           <w:t>[source]</w:t>
@@ -3856,7 +3904,7 @@
       <w:hyperlink r:id="rId23">
         <w:r>
           <w:rPr>
-            <w:color w:val="51A6C8"/>
+            <w:color w:val="000000"/>
             <w:u w:val="single"/>
           </w:rPr>
           <w:t>[source]</w:t>
@@ -3878,7 +3926,7 @@
       <w:hyperlink r:id="rId24">
         <w:r>
           <w:rPr>
-            <w:color w:val="51A6C8"/>
+            <w:color w:val="000000"/>
             <w:u w:val="single"/>
           </w:rPr>
           <w:t>[source]</w:t>
@@ -3900,7 +3948,7 @@
       <w:hyperlink r:id="rId25">
         <w:r>
           <w:rPr>
-            <w:color w:val="51A6C8"/>
+            <w:color w:val="000000"/>
             <w:u w:val="single"/>
           </w:rPr>
           <w:t>[source]</w:t>
@@ -3922,7 +3970,7 @@
       <w:hyperlink r:id="rId26">
         <w:r>
           <w:rPr>
-            <w:color w:val="51A6C8"/>
+            <w:color w:val="000000"/>
             <w:u w:val="single"/>
           </w:rPr>
           <w:t>[source]</w:t>
@@ -3944,7 +3992,7 @@
       <w:hyperlink r:id="rId27">
         <w:r>
           <w:rPr>
-            <w:color w:val="51A6C8"/>
+            <w:color w:val="000000"/>
             <w:u w:val="single"/>
           </w:rPr>
           <w:t>[source]</w:t>
@@ -3966,7 +4014,7 @@
       <w:hyperlink r:id="rId28">
         <w:r>
           <w:rPr>
-            <w:color w:val="51A6C8"/>
+            <w:color w:val="000000"/>
             <w:u w:val="single"/>
           </w:rPr>
           <w:t>[source]</w:t>
@@ -3983,12 +4031,12 @@
         <w:rPr>
           <w:sz w:val="18"/>
         </w:rPr>
-        <w:t xml:space="preserve">[9] PostgreSQL Global Development Group. (2026). PostgreSQL 16 documentation: WITH queries (common table expressions). </w:t>
+        <w:t xml:space="preserve">[9] Sellen, A., &amp; Whittaker, S. (2010). Beyond total capture: A constructive critique of lifelogging. Communications of the ACM, 53(5), 70–77. DOI: 10.1145/1735223.1735243. </w:t>
       </w:r>
       <w:hyperlink r:id="rId29">
         <w:r>
           <w:rPr>
-            <w:color w:val="51A6C8"/>
+            <w:color w:val="000000"/>
             <w:u w:val="single"/>
           </w:rPr>
           <w:t>[source]</w:t>
@@ -4005,12 +4053,12 @@
         <w:rPr>
           <w:sz w:val="18"/>
         </w:rPr>
-        <w:t xml:space="preserve">[10] PostgreSQL Global Development Group. (2026). PostgreSQL 16 documentation: Indexes and index types. </w:t>
+        <w:t xml:space="preserve">[10] Elsweiler, D., Ruthven, I., &amp; Jones, C. (2007). Towards memory-supporting personal information management tools. Journal of the American Society for Information Science and Technology, 58(7), 924–946. DOI: 10.1002/asi.20570. </w:t>
       </w:r>
       <w:hyperlink r:id="rId30">
         <w:r>
           <w:rPr>
-            <w:color w:val="51A6C8"/>
+            <w:color w:val="000000"/>
             <w:u w:val="single"/>
           </w:rPr>
           <w:t>[source]</w:t>
@@ -4027,12 +4075,12 @@
         <w:rPr>
           <w:sz w:val="18"/>
         </w:rPr>
-        <w:t xml:space="preserve">[11] PostgreSQL Global Development Group. (2026). PostgreSQL 16 documentation: Transaction isolation. </w:t>
+        <w:t xml:space="preserve">[11] Thudt, A., Baur, D., &amp; Carpendale, S. (2013). Visits: A spatiotemporal visualization of location histories. EuroVis Short Papers, 79–83. DOI: 10.2312/PE.EuroVisShort.EuroVisShort2013.079-083. </w:t>
       </w:r>
       <w:hyperlink r:id="rId31">
         <w:r>
           <w:rPr>
-            <w:color w:val="51A6C8"/>
+            <w:color w:val="000000"/>
             <w:u w:val="single"/>
           </w:rPr>
           <w:t>[source]</w:t>
@@ -4049,12 +4097,12 @@
         <w:rPr>
           <w:sz w:val="18"/>
         </w:rPr>
-        <w:t xml:space="preserve">[12] PostGIS Project Steering Committee. (2026). ST_DWithin: Tests whether geometries are within a distance. </w:t>
+        <w:t xml:space="preserve">[12] Ribeiro, R., Trifan, A., &amp; Neves, A. J. R. (2022). Lifelog retrieval from daily digital data: Narrative review. JMIR mHealth and uHealth, 10(5), e30517. DOI: 10.2196/30517. </w:t>
       </w:r>
       <w:hyperlink r:id="rId32">
         <w:r>
           <w:rPr>
-            <w:color w:val="51A6C8"/>
+            <w:color w:val="000000"/>
             <w:u w:val="single"/>
           </w:rPr>
           <w:t>[source]</w:t>
@@ -4071,12 +4119,12 @@
         <w:rPr>
           <w:sz w:val="18"/>
         </w:rPr>
-        <w:t xml:space="preserve">[13] PostGIS Project Steering Committee. (2026). ST_LineLocatePoint: Fractional location of a point along a LineString. </w:t>
+        <w:t xml:space="preserve">[13] Duane, A., Jónsson, B. Þ., Lee, H., &amp; Gurrin, C. (2023). LAD: An application design model to support the analysis of large-scale personal data collections generated by lifelogging. Personal and Ubiquitous Computing, 27, 2133–2145. DOI: 10.1007/s00779-023-01726-z. </w:t>
       </w:r>
       <w:hyperlink r:id="rId33">
         <w:r>
           <w:rPr>
-            <w:color w:val="51A6C8"/>
+            <w:color w:val="000000"/>
             <w:u w:val="single"/>
           </w:rPr>
           <w:t>[source]</w:t>
@@ -4093,73 +4141,55 @@
         <w:rPr>
           <w:sz w:val="18"/>
         </w:rPr>
-        <w:t xml:space="preserve">[14] PostgreSQL Global Development Group. (2026). PostgreSQL 16 documentation: CREATE MATERIALIZED VIEW and REFRESH MATERIALIZED VIEW. </w:t>
+        <w:t xml:space="preserve">[14] PostgreSQL Global Development Group. (2026). PostgreSQL 16 documentation: Recursive WITH queries, indexes and index types, transaction isolation, and materialized views. </w:t>
       </w:r>
       <w:hyperlink r:id="rId34">
         <w:r>
           <w:rPr>
-            <w:color w:val="51A6C8"/>
+            <w:color w:val="000000"/>
             <w:u w:val="single"/>
           </w:rPr>
-          <w:t>[source]</w:t>
+          <w:t>[WITH]</w:t>
         </w:r>
       </w:hyperlink>
-    </w:p>
-    <w:p>
-      <w:pPr>
-        <w:spacing w:after="40" w:line="240" w:lineRule="auto"/>
-        <w:ind w:left="346" w:hanging="346"/>
-        <w:jc w:val="left"/>
-      </w:pPr>
       <w:r>
-        <w:rPr>
-          <w:sz w:val="18"/>
-        </w:rPr>
-        <w:t xml:space="preserve">[15] Citus Data. (2026). pg_cron: Run periodic jobs in PostgreSQL. GitHub project documentation. </w:t>
+        <w:t xml:space="preserve"> </w:t>
       </w:r>
       <w:hyperlink r:id="rId35">
         <w:r>
           <w:rPr>
-            <w:color w:val="51A6C8"/>
+            <w:color w:val="000000"/>
             <w:u w:val="single"/>
           </w:rPr>
-          <w:t>[source]</w:t>
+          <w:t>[Indexes]</w:t>
         </w:r>
       </w:hyperlink>
-    </w:p>
-    <w:p>
-      <w:pPr>
-        <w:spacing w:after="40" w:line="240" w:lineRule="auto"/>
-        <w:ind w:left="346" w:hanging="346"/>
-        <w:jc w:val="left"/>
-      </w:pPr>
       <w:r>
-        <w:rPr>
-          <w:sz w:val="18"/>
-        </w:rPr>
-        <w:t xml:space="preserve">[16] Butler, H., Daly, M., Doyle, A., Gillies, S., Hagen, S., &amp; Schaub, T. (2016). The GeoJSON format (RFC 7946). Internet Engineering Task Force. DOI: 10.17487/RFC7946. </w:t>
+        <w:t xml:space="preserve"> </w:t>
       </w:r>
       <w:hyperlink r:id="rId36">
         <w:r>
           <w:rPr>
-            <w:color w:val="51A6C8"/>
+            <w:color w:val="000000"/>
             <w:u w:val="single"/>
           </w:rPr>
-          <w:t>[source]</w:t>
+          <w:t>[Transactions]</w:t>
         </w:r>
       </w:hyperlink>
-    </w:p>
-    <w:p>
-      <w:pPr>
-        <w:spacing w:after="40" w:line="240" w:lineRule="auto"/>
-        <w:ind w:left="346" w:hanging="346"/>
-        <w:jc w:val="left"/>
-      </w:pPr>
       <w:r>
-        <w:rPr>
-          <w:sz w:val="18"/>
-        </w:rPr>
-        <w:t xml:space="preserve">[17] MemoryScape project team. (2026). Database migrations, algorithm specifications, synthetic evaluation artifacts, and implementation status. BCSE497J Project I repository, Vellore Institute of Technology. </w:t>
+        <w:t xml:space="preserve"> </w:t>
+      </w:r>
+      <w:hyperlink r:id="rId37">
+        <w:r>
+          <w:rPr>
+            <w:color w:val="000000"/>
+            <w:u w:val="single"/>
+          </w:rPr>
+          <w:t>[Materialized views]</w:t>
+        </w:r>
+      </w:hyperlink>
+      <w:r>
+        <w:t xml:space="preserve"> </w:t>
       </w:r>
     </w:p>
     <w:p>
@@ -4172,17 +4202,32 @@
         <w:rPr>
           <w:sz w:val="18"/>
         </w:rPr>
-        <w:t xml:space="preserve">[18] Sellen, A., &amp; Whittaker, S. (2010). Beyond total capture: A constructive critique of lifelogging. Communications of the ACM, 53(5), 70–77. DOI: 10.1145/1735223.1735243. </w:t>
+        <w:t xml:space="preserve">[15] PostGIS Project Steering Committee. (2026). PostGIS reference: ST_DWithin and ST_LineLocatePoint. </w:t>
       </w:r>
-      <w:hyperlink r:id="rId37">
+      <w:hyperlink r:id="rId38">
         <w:r>
           <w:rPr>
-            <w:color w:val="51A6C8"/>
+            <w:color w:val="000000"/>
             <w:u w:val="single"/>
           </w:rPr>
-          <w:t>[source]</w:t>
+          <w:t>[ST_DWithin]</w:t>
         </w:r>
       </w:hyperlink>
+      <w:r>
+        <w:t xml:space="preserve"> </w:t>
+      </w:r>
+      <w:hyperlink r:id="rId39">
+        <w:r>
+          <w:rPr>
+            <w:color w:val="000000"/>
+            <w:u w:val="single"/>
+          </w:rPr>
+          <w:t>[ST_LineLocatePoint]</w:t>
+        </w:r>
+      </w:hyperlink>
+      <w:r>
+        <w:t xml:space="preserve"> </w:t>
+      </w:r>
     </w:p>
     <w:p>
       <w:pPr>
@@ -4194,78 +4239,12 @@
         <w:rPr>
           <w:sz w:val="18"/>
         </w:rPr>
-        <w:t xml:space="preserve">[19] Elsweiler, D., Ruthven, I., &amp; Jones, C. (2007). Towards memory-supporting personal information management tools. Journal of the American Society for Information Science and Technology, 58(7), 924–946. DOI: 10.1002/asi.20570. </w:t>
-      </w:r>
-      <w:hyperlink r:id="rId38">
-        <w:r>
-          <w:rPr>
-            <w:color w:val="51A6C8"/>
-            <w:u w:val="single"/>
-          </w:rPr>
-          <w:t>[source]</w:t>
-        </w:r>
-      </w:hyperlink>
-    </w:p>
-    <w:p>
-      <w:pPr>
-        <w:spacing w:after="40" w:line="240" w:lineRule="auto"/>
-        <w:ind w:left="346" w:hanging="346"/>
-        <w:jc w:val="left"/>
-      </w:pPr>
-      <w:r>
-        <w:rPr>
-          <w:sz w:val="18"/>
-        </w:rPr>
-        <w:t xml:space="preserve">[20] Thudt, A., Baur, D., &amp; Carpendale, S. (2013). Visits: A spatiotemporal visualization of location histories. EuroVis Short Papers, 79–83. DOI: 10.2312/PE.EuroVisShort.EuroVisShort2013.079-083. </w:t>
-      </w:r>
-      <w:hyperlink r:id="rId39">
-        <w:r>
-          <w:rPr>
-            <w:color w:val="51A6C8"/>
-            <w:u w:val="single"/>
-          </w:rPr>
-          <w:t>[source]</w:t>
-        </w:r>
-      </w:hyperlink>
-    </w:p>
-    <w:p>
-      <w:pPr>
-        <w:spacing w:after="40" w:line="240" w:lineRule="auto"/>
-        <w:ind w:left="346" w:hanging="346"/>
-        <w:jc w:val="left"/>
-      </w:pPr>
-      <w:r>
-        <w:rPr>
-          <w:sz w:val="18"/>
-        </w:rPr>
-        <w:t xml:space="preserve">[21] Ribeiro, R., Trifan, A., &amp; Neves, A. J. R. (2022). Lifelog retrieval from daily digital data: Narrative review. JMIR mHealth and uHealth, 10(5), e30517. DOI: 10.2196/30517. </w:t>
+        <w:t xml:space="preserve">[16] Citus Data. (2026). pg_cron: Run periodic jobs in PostgreSQL. GitHub project documentation. </w:t>
       </w:r>
       <w:hyperlink r:id="rId40">
         <w:r>
           <w:rPr>
-            <w:color w:val="51A6C8"/>
-            <w:u w:val="single"/>
-          </w:rPr>
-          <w:t>[source]</w:t>
-        </w:r>
-      </w:hyperlink>
-    </w:p>
-    <w:p>
-      <w:pPr>
-        <w:spacing w:after="40" w:line="240" w:lineRule="auto"/>
-        <w:ind w:left="346" w:hanging="346"/>
-        <w:jc w:val="left"/>
-      </w:pPr>
-      <w:r>
-        <w:rPr>
-          <w:sz w:val="18"/>
-        </w:rPr>
-        <w:t xml:space="preserve">[22] Duane, A., Jónsson, B. Þ., Lee, H., &amp; Gurrin, C. (2023). LAD: An application design model to support the analysis of large-scale personal data collections generated by lifelogging. Personal and Ubiquitous Computing, 27, 2133–2145. DOI: 10.1007/s00779-023-01726-z. </w:t>
-      </w:r>
-      <w:hyperlink r:id="rId41">
-        <w:r>
-          <w:rPr>
-            <w:color w:val="51A6C8"/>
+            <w:color w:val="000000"/>
             <w:u w:val="single"/>
           </w:rPr>
           <w:t>[source]</w:t>
@@ -4277,7 +4256,7 @@
         <w:pStyle w:val="Caption"/>
       </w:pPr>
       <w:r>
-        <w:t>Twelve peer-reviewed memory, lifelogging, visualization, and personal-information-management works, plus Ebbinghaus’s foundational book, inform the discussion. Product behavior and reported measurements are grounded in the committed implementation and its evaluation artifacts; all synthetic results are identified as such.</w:t>
+        <w:t>The bibliography is limited to 16 sources: 12 peer-reviewed papers, Ebbinghaus’s foundational book, and three consolidated primary technical-documentation references. Product behavior and reported measurements are grounded in the committed implementation and its evaluation artifacts; all synthetic results are identified as such.</w:t>
       </w:r>
     </w:p>
     <w:sectPr>
@@ -4514,7 +4493,7 @@
     <w:r>
       <w:rPr>
         <w:rFonts w:ascii="Arial" w:hAnsi="Arial"/>
-        <w:color w:val="596579"/>
+        <w:color w:val="000000"/>
         <w:sz w:val="16"/>
       </w:rPr>
       <w:t xml:space="preserve">VIT VELLORE  ·  IMPLEMENTATION-BASED REPORT  ·  PAGE </w:t>
@@ -4541,7 +4520,7 @@
       <w:rPr>
         <w:rFonts w:ascii="Arial" w:hAnsi="Arial"/>
         <w:b/>
-        <w:color w:val="596579"/>
+        <w:color w:val="000000"/>
         <w:sz w:val="16"/>
       </w:rPr>
       <w:t>MEMORYSCAPE  /  BCSE497J · PROJECT I</w:t>
@@ -5440,7 +5419,7 @@
     </w:pPr>
     <w:rPr>
       <w:rFonts w:ascii="Arial" w:hAnsi="Arial" w:eastAsia="Times New Roman" w:cs="Times New Roman"/>
-      <w:color w:val="242B3B"/>
+      <w:color w:val="000000"/>
       <w:kern w:val="0"/>
       <w:sz w:val="21"/>
       <w:szCs w:val="24"/>
@@ -6072,7 +6051,7 @@
       <w:rFonts w:ascii="Arial" w:hAnsi="Arial"/>
       <w:i/>
       <w:iCs/>
-      <w:color w:val="596579"/>
+      <w:color w:val="000000"/>
       <w:sz w:val="17"/>
       <w:szCs w:val="18"/>
     </w:rPr>
@@ -22163,7 +22142,7 @@
     <w:rPr>
       <w:rFonts w:ascii="Arial" w:hAnsi="Arial"/>
       <w:b/>
-      <w:color w:val="17213B"/>
+      <w:color w:val="000000"/>
       <w:sz w:val="38"/>
     </w:rPr>
   </w:style>
@@ -22176,7 +22155,7 @@
     <w:rPr>
       <w:rFonts w:ascii="Arial" w:hAnsi="Arial"/>
       <w:b/>
-      <w:color w:val="7776D8"/>
+      <w:color w:val="000000"/>
       <w:sz w:val="26"/>
     </w:rPr>
   </w:style>
@@ -22189,7 +22168,7 @@
     <w:rPr>
       <w:rFonts w:ascii="Arial" w:hAnsi="Arial"/>
       <w:b/>
-      <w:color w:val="51A6C8"/>
+      <w:color w:val="000000"/>
       <w:sz w:val="22"/>
     </w:rPr>
   </w:style>

</xml_diff>

<commit_message>
Simplify report figures with LibreOffice Draw
</commit_message>
<xml_diff>
--- a/MemoryScape_Project_Report_Final.docx
+++ b/MemoryScape_Project_Report_Final.docx
@@ -61,7 +61,7 @@
         <w:tc>
           <w:tcPr>
             <w:tcW w:type="dxa" w:w="9544"/>
-            <w:shd w:fill="000000"/>
+            <w:shd w:fill="FFFFFF"/>
             <w:tcMar>
               <w:top w:w="220" w:type="dxa"/>
               <w:start w:w="250" w:type="dxa"/>
@@ -77,7 +77,7 @@
               <w:rPr>
                 <w:rFonts w:ascii="Arial" w:hAnsi="Arial"/>
                 <w:b/>
-                <w:color w:val="FFFFFF"/>
+                <w:color w:val="000000"/>
                 <w:sz w:val="22"/>
               </w:rPr>
               <w:t>IMPLEMENTATION-BASED PROJECT REPORT</w:t>
@@ -275,7 +275,7 @@
         <w:tc>
           <w:tcPr>
             <w:tcW w:type="dxa" w:w="3384"/>
-            <w:shd w:fill="000000"/>
+            <w:shd w:fill="FFFFFF"/>
             <w:tcMar>
               <w:top w:w="90" w:type="dxa"/>
               <w:start w:w="110" w:type="dxa"/>
@@ -292,7 +292,7 @@
               <w:rPr>
                 <w:rFonts w:ascii="Arial" w:hAnsi="Arial"/>
                 <w:b/>
-                <w:color w:val="FFFFFF"/>
+                <w:color w:val="000000"/>
                 <w:sz w:val="18"/>
               </w:rPr>
               <w:t>Section</w:t>
@@ -302,7 +302,7 @@
         <w:tc>
           <w:tcPr>
             <w:tcW w:type="dxa" w:w="4968"/>
-            <w:shd w:fill="000000"/>
+            <w:shd w:fill="FFFFFF"/>
             <w:tcMar>
               <w:top w:w="90" w:type="dxa"/>
               <w:start w:w="110" w:type="dxa"/>
@@ -319,7 +319,7 @@
               <w:rPr>
                 <w:rFonts w:ascii="Arial" w:hAnsi="Arial"/>
                 <w:b/>
-                <w:color w:val="FFFFFF"/>
+                <w:color w:val="000000"/>
                 <w:sz w:val="18"/>
               </w:rPr>
               <w:t>Coverage</w:t>
@@ -329,7 +329,7 @@
         <w:tc>
           <w:tcPr>
             <w:tcW w:type="dxa" w:w="792"/>
-            <w:shd w:fill="000000"/>
+            <w:shd w:fill="FFFFFF"/>
             <w:tcMar>
               <w:top w:w="90" w:type="dxa"/>
               <w:start w:w="110" w:type="dxa"/>
@@ -346,7 +346,7 @@
               <w:rPr>
                 <w:rFonts w:ascii="Arial" w:hAnsi="Arial"/>
                 <w:b/>
-                <w:color w:val="FFFFFF"/>
+                <w:color w:val="000000"/>
                 <w:sz w:val="18"/>
               </w:rPr>
               <w:t>Page</w:t>
@@ -829,7 +829,7 @@
                 <w:color w:val="000000"/>
                 <w:sz w:val="18"/>
               </w:rPr>
-              <w:t>9</w:t>
+              <w:t>10</w:t>
             </w:r>
           </w:p>
         </w:tc>
@@ -909,7 +909,7 @@
                 <w:color w:val="000000"/>
                 <w:sz w:val="18"/>
               </w:rPr>
-              <w:t>12</w:t>
+              <w:t>14</w:t>
             </w:r>
           </w:p>
         </w:tc>
@@ -989,7 +989,7 @@
                 <w:color w:val="000000"/>
                 <w:sz w:val="18"/>
               </w:rPr>
-              <w:t>13</w:t>
+              <w:t>15</w:t>
             </w:r>
           </w:p>
         </w:tc>
@@ -1374,7 +1374,7 @@
         <w:tc>
           <w:tcPr>
             <w:tcW w:type="dxa" w:w="2160"/>
-            <w:shd w:fill="000000"/>
+            <w:shd w:fill="FFFFFF"/>
             <w:tcMar>
               <w:top w:w="90" w:type="dxa"/>
               <w:start w:w="110" w:type="dxa"/>
@@ -1391,7 +1391,7 @@
               <w:rPr>
                 <w:rFonts w:ascii="Arial" w:hAnsi="Arial"/>
                 <w:b/>
-                <w:color w:val="FFFFFF"/>
+                <w:color w:val="000000"/>
                 <w:sz w:val="18"/>
               </w:rPr>
               <w:t>Question</w:t>
@@ -1401,7 +1401,7 @@
         <w:tc>
           <w:tcPr>
             <w:tcW w:type="dxa" w:w="7056"/>
-            <w:shd w:fill="000000"/>
+            <w:shd w:fill="FFFFFF"/>
             <w:tcMar>
               <w:top w:w="90" w:type="dxa"/>
               <w:start w:w="110" w:type="dxa"/>
@@ -1418,7 +1418,7 @@
               <w:rPr>
                 <w:rFonts w:ascii="Arial" w:hAnsi="Arial"/>
                 <w:b/>
-                <w:color w:val="FFFFFF"/>
+                <w:color w:val="000000"/>
                 <w:sz w:val="18"/>
               </w:rPr>
               <w:t>Operational test</w:t>
@@ -1752,7 +1752,7 @@
       <w:r>
         <w:drawing>
           <wp:inline xmlns:a="http://schemas.openxmlformats.org/drawingml/2006/main">
-            <wp:extent cx="5989320" cy="2888966"/>
+            <wp:extent cx="5989320" cy="4234657"/>
             <wp:docPr id="1" name="Picture 1"/>
             <wp:cNvGraphicFramePr>
               <a:graphicFrameLocks noChangeAspect="1"/>
@@ -1773,7 +1773,7 @@
                   <pic:spPr>
                     <a:xfrm>
                       <a:off x="0" y="0"/>
-                      <a:ext cx="5989320" cy="2888966"/>
+                      <a:ext cx="5989320" cy="4234657"/>
                     </a:xfrm>
                     <a:prstGeom prst="rect"/>
                   </pic:spPr>
@@ -1818,7 +1818,7 @@
       <w:r>
         <w:drawing>
           <wp:inline xmlns:a="http://schemas.openxmlformats.org/drawingml/2006/main">
-            <wp:extent cx="5257800" cy="2783541"/>
+            <wp:extent cx="5257800" cy="3717447"/>
             <wp:docPr id="2" name="Picture 2"/>
             <wp:cNvGraphicFramePr>
               <a:graphicFrameLocks noChangeAspect="1"/>
@@ -1839,7 +1839,7 @@
                   <pic:spPr>
                     <a:xfrm>
                       <a:off x="0" y="0"/>
-                      <a:ext cx="5257800" cy="2783541"/>
+                      <a:ext cx="5257800" cy="3717447"/>
                     </a:xfrm>
                     <a:prstGeom prst="rect"/>
                   </pic:spPr>
@@ -1963,7 +1963,7 @@
         <w:tc>
           <w:tcPr>
             <w:tcW w:type="dxa" w:w="2016"/>
-            <w:shd w:fill="000000"/>
+            <w:shd w:fill="FFFFFF"/>
             <w:tcMar>
               <w:top w:w="90" w:type="dxa"/>
               <w:start w:w="110" w:type="dxa"/>
@@ -1980,7 +1980,7 @@
               <w:rPr>
                 <w:rFonts w:ascii="Arial" w:hAnsi="Arial"/>
                 <w:b/>
-                <w:color w:val="FFFFFF"/>
+                <w:color w:val="000000"/>
                 <w:sz w:val="17"/>
               </w:rPr>
               <w:t>Layer</w:t>
@@ -1990,7 +1990,7 @@
         <w:tc>
           <w:tcPr>
             <w:tcW w:type="dxa" w:w="7200"/>
-            <w:shd w:fill="000000"/>
+            <w:shd w:fill="FFFFFF"/>
             <w:tcMar>
               <w:top w:w="90" w:type="dxa"/>
               <w:start w:w="110" w:type="dxa"/>
@@ -2007,7 +2007,7 @@
               <w:rPr>
                 <w:rFonts w:ascii="Arial" w:hAnsi="Arial"/>
                 <w:b/>
-                <w:color w:val="FFFFFF"/>
+                <w:color w:val="000000"/>
                 <w:sz w:val="17"/>
               </w:rPr>
               <w:t>Current implementation</w:t>
@@ -2366,7 +2366,7 @@
         <w:tc>
           <w:tcPr>
             <w:tcW w:type="dxa" w:w="2664"/>
-            <w:shd w:fill="000000"/>
+            <w:shd w:fill="FFFFFF"/>
             <w:tcMar>
               <w:top w:w="90" w:type="dxa"/>
               <w:start w:w="110" w:type="dxa"/>
@@ -2383,7 +2383,7 @@
               <w:rPr>
                 <w:rFonts w:ascii="Arial" w:hAnsi="Arial"/>
                 <w:b/>
-                <w:color w:val="FFFFFF"/>
+                <w:color w:val="000000"/>
                 <w:sz w:val="17"/>
               </w:rPr>
               <w:t>Validation evidence</w:t>
@@ -2393,7 +2393,7 @@
         <w:tc>
           <w:tcPr>
             <w:tcW w:type="dxa" w:w="6552"/>
-            <w:shd w:fill="000000"/>
+            <w:shd w:fill="FFFFFF"/>
             <w:tcMar>
               <w:top w:w="90" w:type="dxa"/>
               <w:start w:w="110" w:type="dxa"/>
@@ -2410,7 +2410,7 @@
               <w:rPr>
                 <w:rFonts w:ascii="Arial" w:hAnsi="Arial"/>
                 <w:b/>
-                <w:color w:val="FFFFFF"/>
+                <w:color w:val="000000"/>
                 <w:sz w:val="17"/>
               </w:rPr>
               <w:t>Latest recorded result</w:t>
@@ -2716,7 +2716,7 @@
       <w:r>
         <w:drawing>
           <wp:inline xmlns:a="http://schemas.openxmlformats.org/drawingml/2006/main">
-            <wp:extent cx="5989320" cy="3241279"/>
+            <wp:extent cx="5989320" cy="4234657"/>
             <wp:docPr id="3" name="Picture 3"/>
             <wp:cNvGraphicFramePr>
               <a:graphicFrameLocks noChangeAspect="1"/>
@@ -2737,7 +2737,7 @@
                   <pic:spPr>
                     <a:xfrm>
                       <a:off x="0" y="0"/>
-                      <a:ext cx="5989320" cy="3241279"/>
+                      <a:ext cx="5989320" cy="4234657"/>
                     </a:xfrm>
                     <a:prstGeom prst="rect"/>
                   </pic:spPr>
@@ -2778,7 +2778,7 @@
         <w:tc>
           <w:tcPr>
             <w:tcW w:type="dxa" w:w="4896"/>
-            <w:shd w:fill="000000"/>
+            <w:shd w:fill="FFFFFF"/>
             <w:tcMar>
               <w:top w:w="90" w:type="dxa"/>
               <w:start w:w="110" w:type="dxa"/>
@@ -2795,7 +2795,7 @@
               <w:rPr>
                 <w:rFonts w:ascii="Arial" w:hAnsi="Arial"/>
                 <w:b/>
-                <w:color w:val="FFFFFF"/>
+                <w:color w:val="000000"/>
                 <w:sz w:val="17"/>
               </w:rPr>
               <w:t>Query (median ms)</w:t>
@@ -2805,7 +2805,7 @@
         <w:tc>
           <w:tcPr>
             <w:tcW w:type="dxa" w:w="2160"/>
-            <w:shd w:fill="000000"/>
+            <w:shd w:fill="FFFFFF"/>
             <w:tcMar>
               <w:top w:w="90" w:type="dxa"/>
               <w:start w:w="110" w:type="dxa"/>
@@ -2822,7 +2822,7 @@
               <w:rPr>
                 <w:rFonts w:ascii="Arial" w:hAnsi="Arial"/>
                 <w:b/>
-                <w:color w:val="FFFFFF"/>
+                <w:color w:val="000000"/>
                 <w:sz w:val="17"/>
               </w:rPr>
               <w:t>10,000 memories</w:t>
@@ -2832,7 +2832,7 @@
         <w:tc>
           <w:tcPr>
             <w:tcW w:type="dxa" w:w="2160"/>
-            <w:shd w:fill="000000"/>
+            <w:shd w:fill="FFFFFF"/>
             <w:tcMar>
               <w:top w:w="90" w:type="dxa"/>
               <w:start w:w="110" w:type="dxa"/>
@@ -2849,7 +2849,7 @@
               <w:rPr>
                 <w:rFonts w:ascii="Arial" w:hAnsi="Arial"/>
                 <w:b/>
-                <w:color w:val="FFFFFF"/>
+                <w:color w:val="000000"/>
                 <w:sz w:val="17"/>
               </w:rPr>
               <w:t>50,000 memories</w:t>

</xml_diff>

<commit_message>
Use editable report diagrams and add presentation guide
</commit_message>
<xml_diff>
--- a/MemoryScape_Project_Report_Final.docx
+++ b/MemoryScape_Project_Report_Final.docx
@@ -829,7 +829,7 @@
                 <w:color w:val="000000"/>
                 <w:sz w:val="18"/>
               </w:rPr>
-              <w:t>10</w:t>
+              <w:t>9</w:t>
             </w:r>
           </w:p>
         </w:tc>
@@ -909,7 +909,7 @@
                 <w:color w:val="000000"/>
                 <w:sz w:val="18"/>
               </w:rPr>
-              <w:t>14</w:t>
+              <w:t>12</w:t>
             </w:r>
           </w:p>
         </w:tc>
@@ -989,7 +989,7 @@
                 <w:color w:val="000000"/>
                 <w:sz w:val="18"/>
               </w:rPr>
-              <w:t>15</w:t>
+              <w:t>13</w:t>
             </w:r>
           </w:p>
         </w:tc>
@@ -1742,48 +1742,381 @@
         <w:t>The Next.js interface submits validated requests to a TypeScript API. The API issues parameterized SQL against PostgreSQL. The database performs route filtering and ordering, decay and reinforcement, recursive path expansion, and materialized-view refresh. The browser renders geometry, timelines, nodes, edges, and database-provided explanations.</w:t>
       </w:r>
     </w:p>
+    <w:tbl>
+      <w:tblPr>
+        <w:tblStyle w:val="12"/>
+        <w:tblW w:type="auto" w:w="0"/>
+        <w:jc w:val="center"/>
+        <w:tblLayout w:type="fixed"/>
+        <w:tblLook w:firstColumn="1" w:firstRow="1" w:lastColumn="0" w:lastRow="0" w:noHBand="0" w:noVBand="1" w:val="04A0"/>
+      </w:tblPr>
+      <w:tblGrid>
+        <w:gridCol w:w="1909"/>
+        <w:gridCol w:w="1909"/>
+        <w:gridCol w:w="1909"/>
+        <w:gridCol w:w="1909"/>
+        <w:gridCol w:w="1909"/>
+      </w:tblGrid>
+      <w:tr>
+        <w:tc>
+          <w:tcPr>
+            <w:tcW w:type="dxa" w:w="2232"/>
+            <w:vAlign w:val="center"/>
+            <w:tcMar>
+              <w:top w:w="120" w:type="dxa"/>
+              <w:start w:w="90" w:type="dxa"/>
+              <w:bottom w:w="120" w:type="dxa"/>
+              <w:end w:w="90" w:type="dxa"/>
+            </w:tcMar>
+            <w:tcBorders>
+              <w:top w:val="single" w:sz="8" w:color="000000"/>
+              <w:left w:val="single" w:sz="8" w:color="000000"/>
+              <w:bottom w:val="single" w:sz="8" w:color="000000"/>
+              <w:right w:val="single" w:sz="8" w:color="000000"/>
+            </w:tcBorders>
+          </w:tcPr>
+          <w:p>
+            <w:pPr>
+              <w:spacing w:after="0"/>
+              <w:jc w:val="center"/>
+            </w:pPr>
+            <w:r>
+              <w:rPr>
+                <w:rFonts w:ascii="Arial" w:hAnsi="Arial"/>
+                <w:b/>
+                <w:sz w:val="18"/>
+              </w:rPr>
+              <w:t>WEB INTERFACE</w:t>
+            </w:r>
+          </w:p>
+          <w:p>
+            <w:pPr>
+              <w:spacing w:after="0"/>
+              <w:jc w:val="center"/>
+            </w:pPr>
+            <w:r>
+              <w:rPr>
+                <w:rFonts w:ascii="Arial" w:hAnsi="Arial"/>
+                <w:sz w:val="16"/>
+              </w:rPr>
+              <w:t>Map · timeline · graph</w:t>
+            </w:r>
+          </w:p>
+        </w:tc>
+        <w:tc>
+          <w:tcPr>
+            <w:tcW w:type="dxa" w:w="504"/>
+            <w:vAlign w:val="center"/>
+            <w:tcMar>
+              <w:top w:w="120" w:type="dxa"/>
+              <w:start w:w="90" w:type="dxa"/>
+              <w:bottom w:w="120" w:type="dxa"/>
+              <w:end w:w="90" w:type="dxa"/>
+            </w:tcMar>
+            <w:tcBorders>
+              <w:top w:val="nil"/>
+              <w:left w:val="nil"/>
+              <w:bottom w:val="nil"/>
+              <w:right w:val="nil"/>
+            </w:tcBorders>
+          </w:tcPr>
+          <w:p>
+            <w:pPr>
+              <w:spacing w:after="0"/>
+              <w:jc w:val="center"/>
+            </w:pPr>
+            <w:r>
+              <w:rPr>
+                <w:rFonts w:ascii="Arial" w:hAnsi="Arial"/>
+                <w:sz w:val="16"/>
+              </w:rPr>
+              <w:t>→</w:t>
+            </w:r>
+          </w:p>
+        </w:tc>
+        <w:tc>
+          <w:tcPr>
+            <w:tcW w:type="dxa" w:w="2232"/>
+            <w:vAlign w:val="center"/>
+            <w:tcMar>
+              <w:top w:w="120" w:type="dxa"/>
+              <w:start w:w="90" w:type="dxa"/>
+              <w:bottom w:w="120" w:type="dxa"/>
+              <w:end w:w="90" w:type="dxa"/>
+            </w:tcMar>
+            <w:tcBorders>
+              <w:top w:val="single" w:sz="8" w:color="000000"/>
+              <w:left w:val="single" w:sz="8" w:color="000000"/>
+              <w:bottom w:val="single" w:sz="8" w:color="000000"/>
+              <w:right w:val="single" w:sz="8" w:color="000000"/>
+            </w:tcBorders>
+          </w:tcPr>
+          <w:p>
+            <w:pPr>
+              <w:spacing w:after="0"/>
+              <w:jc w:val="center"/>
+            </w:pPr>
+            <w:r>
+              <w:rPr>
+                <w:rFonts w:ascii="Arial" w:hAnsi="Arial"/>
+                <w:b/>
+                <w:sz w:val="18"/>
+              </w:rPr>
+              <w:t>API</w:t>
+            </w:r>
+          </w:p>
+          <w:p>
+            <w:pPr>
+              <w:spacing w:after="0"/>
+              <w:jc w:val="center"/>
+            </w:pPr>
+            <w:r>
+              <w:rPr>
+                <w:rFonts w:ascii="Arial" w:hAnsi="Arial"/>
+                <w:sz w:val="16"/>
+              </w:rPr>
+              <w:t>Validate · parameterized SQL</w:t>
+            </w:r>
+          </w:p>
+        </w:tc>
+        <w:tc>
+          <w:tcPr>
+            <w:tcW w:type="dxa" w:w="504"/>
+            <w:vAlign w:val="center"/>
+            <w:tcMar>
+              <w:top w:w="120" w:type="dxa"/>
+              <w:start w:w="90" w:type="dxa"/>
+              <w:bottom w:w="120" w:type="dxa"/>
+              <w:end w:w="90" w:type="dxa"/>
+            </w:tcMar>
+            <w:tcBorders>
+              <w:top w:val="nil"/>
+              <w:left w:val="nil"/>
+              <w:bottom w:val="nil"/>
+              <w:right w:val="nil"/>
+            </w:tcBorders>
+          </w:tcPr>
+          <w:p>
+            <w:pPr>
+              <w:spacing w:after="0"/>
+              <w:jc w:val="center"/>
+            </w:pPr>
+            <w:r>
+              <w:rPr>
+                <w:rFonts w:ascii="Arial" w:hAnsi="Arial"/>
+                <w:sz w:val="16"/>
+              </w:rPr>
+              <w:t>→</w:t>
+            </w:r>
+          </w:p>
+        </w:tc>
+        <w:tc>
+          <w:tcPr>
+            <w:tcW w:type="dxa" w:w="2880"/>
+            <w:vAlign w:val="center"/>
+            <w:tcMar>
+              <w:top w:w="120" w:type="dxa"/>
+              <w:start w:w="90" w:type="dxa"/>
+              <w:bottom w:w="120" w:type="dxa"/>
+              <w:end w:w="90" w:type="dxa"/>
+            </w:tcMar>
+            <w:tcBorders>
+              <w:top w:val="single" w:sz="8" w:color="000000"/>
+              <w:left w:val="single" w:sz="8" w:color="000000"/>
+              <w:bottom w:val="single" w:sz="8" w:color="000000"/>
+              <w:right w:val="single" w:sz="8" w:color="000000"/>
+            </w:tcBorders>
+          </w:tcPr>
+          <w:p>
+            <w:pPr>
+              <w:spacing w:after="0"/>
+              <w:jc w:val="center"/>
+            </w:pPr>
+            <w:r>
+              <w:rPr>
+                <w:rFonts w:ascii="Arial" w:hAnsi="Arial"/>
+                <w:b/>
+                <w:sz w:val="16"/>
+              </w:rPr>
+              <w:t>POSTGRESQL + POSTGIS</w:t>
+            </w:r>
+          </w:p>
+          <w:p>
+            <w:pPr>
+              <w:spacing w:after="0"/>
+              <w:jc w:val="center"/>
+            </w:pPr>
+            <w:r>
+              <w:rPr>
+                <w:rFonts w:ascii="Arial" w:hAnsi="Arial"/>
+                <w:sz w:val="16"/>
+              </w:rPr>
+              <w:t>Filter · rank · update</w:t>
+            </w:r>
+          </w:p>
+        </w:tc>
+      </w:tr>
+    </w:tbl>
+    <w:p/>
     <w:p>
       <w:pPr>
-        <w:keepNext/>
-        <w:keepLines/>
-        <w:spacing w:before="80" w:after="40"/>
-        <w:jc w:val="center"/>
+        <w:spacing w:after="40"/>
       </w:pPr>
       <w:r>
-        <w:drawing>
-          <wp:inline xmlns:a="http://schemas.openxmlformats.org/drawingml/2006/main">
-            <wp:extent cx="5989320" cy="4234657"/>
-            <wp:docPr id="1" name="Picture 1"/>
-            <wp:cNvGraphicFramePr>
-              <a:graphicFrameLocks noChangeAspect="1"/>
-            </wp:cNvGraphicFramePr>
-            <a:graphic>
-              <a:graphicData uri="http://schemas.openxmlformats.org/drawingml/2006/picture">
-                <pic:pic>
-                  <pic:nvPicPr>
-                    <pic:cNvPr id="0" name="architecture.png"/>
-                    <pic:cNvPicPr/>
-                  </pic:nvPicPr>
-                  <pic:blipFill>
-                    <a:blip r:embed="rId18"/>
-                    <a:stretch>
-                      <a:fillRect/>
-                    </a:stretch>
-                  </pic:blipFill>
-                  <pic:spPr>
-                    <a:xfrm>
-                      <a:off x="0" y="0"/>
-                      <a:ext cx="5989320" cy="4234657"/>
-                    </a:xfrm>
-                    <a:prstGeom prst="rect"/>
-                  </pic:spPr>
-                </pic:pic>
-              </a:graphicData>
-            </a:graphic>
-          </wp:inline>
-        </w:drawing>
+        <w:t>PostgreSQL executes the recall engines:</w:t>
       </w:r>
     </w:p>
+    <w:tbl>
+      <w:tblPr>
+        <w:tblStyle w:val="12"/>
+        <w:tblW w:type="auto" w:w="0"/>
+        <w:jc w:val="center"/>
+        <w:tblLayout w:type="fixed"/>
+        <w:tblLook w:firstColumn="1" w:firstRow="1" w:lastColumn="0" w:lastRow="0" w:noHBand="0" w:noVBand="1" w:val="04A0"/>
+      </w:tblPr>
+      <w:tblGrid>
+        <w:gridCol w:w="3181"/>
+        <w:gridCol w:w="3181"/>
+        <w:gridCol w:w="3181"/>
+      </w:tblGrid>
+      <w:tr>
+        <w:tc>
+          <w:tcPr>
+            <w:tcW w:type="dxa" w:w="2880"/>
+            <w:vAlign w:val="center"/>
+            <w:tcMar>
+              <w:top w:w="120" w:type="dxa"/>
+              <w:start w:w="90" w:type="dxa"/>
+              <w:bottom w:w="120" w:type="dxa"/>
+              <w:end w:w="90" w:type="dxa"/>
+            </w:tcMar>
+            <w:tcBorders>
+              <w:top w:val="single" w:sz="8" w:color="000000"/>
+              <w:left w:val="single" w:sz="8" w:color="000000"/>
+              <w:bottom w:val="single" w:sz="8" w:color="000000"/>
+              <w:right w:val="single" w:sz="8" w:color="000000"/>
+            </w:tcBorders>
+          </w:tcPr>
+          <w:p>
+            <w:pPr>
+              <w:spacing w:after="0"/>
+              <w:jc w:val="center"/>
+            </w:pPr>
+            <w:r>
+              <w:rPr>
+                <w:rFonts w:ascii="Arial" w:hAnsi="Arial"/>
+                <w:b/>
+                <w:sz w:val="18"/>
+              </w:rPr>
+              <w:t>SPATIAL</w:t>
+            </w:r>
+          </w:p>
+          <w:p>
+            <w:pPr>
+              <w:spacing w:after="0"/>
+              <w:jc w:val="center"/>
+            </w:pPr>
+            <w:r>
+              <w:rPr>
+                <w:rFonts w:ascii="Arial" w:hAnsi="Arial"/>
+                <w:sz w:val="16"/>
+              </w:rPr>
+              <w:t>Route proximity · route order</w:t>
+            </w:r>
+          </w:p>
+        </w:tc>
+        <w:tc>
+          <w:tcPr>
+            <w:tcW w:type="dxa" w:w="2880"/>
+            <w:vAlign w:val="center"/>
+            <w:tcMar>
+              <w:top w:w="120" w:type="dxa"/>
+              <w:start w:w="90" w:type="dxa"/>
+              <w:bottom w:w="120" w:type="dxa"/>
+              <w:end w:w="90" w:type="dxa"/>
+            </w:tcMar>
+            <w:tcBorders>
+              <w:top w:val="single" w:sz="8" w:color="000000"/>
+              <w:left w:val="single" w:sz="8" w:color="000000"/>
+              <w:bottom w:val="single" w:sz="8" w:color="000000"/>
+              <w:right w:val="single" w:sz="8" w:color="000000"/>
+            </w:tcBorders>
+          </w:tcPr>
+          <w:p>
+            <w:pPr>
+              <w:spacing w:after="0"/>
+              <w:jc w:val="center"/>
+            </w:pPr>
+            <w:r>
+              <w:rPr>
+                <w:rFonts w:ascii="Arial" w:hAnsi="Arial"/>
+                <w:b/>
+                <w:sz w:val="18"/>
+              </w:rPr>
+              <w:t>TEMPORAL</w:t>
+            </w:r>
+          </w:p>
+          <w:p>
+            <w:pPr>
+              <w:spacing w:after="0"/>
+              <w:jc w:val="center"/>
+            </w:pPr>
+            <w:r>
+              <w:rPr>
+                <w:rFonts w:ascii="Arial" w:hAnsi="Arial"/>
+                <w:sz w:val="16"/>
+              </w:rPr>
+              <w:t>Decay · reinforcement</w:t>
+            </w:r>
+          </w:p>
+        </w:tc>
+        <w:tc>
+          <w:tcPr>
+            <w:tcW w:type="dxa" w:w="2880"/>
+            <w:vAlign w:val="center"/>
+            <w:tcMar>
+              <w:top w:w="120" w:type="dxa"/>
+              <w:start w:w="90" w:type="dxa"/>
+              <w:bottom w:w="120" w:type="dxa"/>
+              <w:end w:w="90" w:type="dxa"/>
+            </w:tcMar>
+            <w:tcBorders>
+              <w:top w:val="single" w:sz="8" w:color="000000"/>
+              <w:left w:val="single" w:sz="8" w:color="000000"/>
+              <w:bottom w:val="single" w:sz="8" w:color="000000"/>
+              <w:right w:val="single" w:sz="8" w:color="000000"/>
+            </w:tcBorders>
+          </w:tcPr>
+          <w:p>
+            <w:pPr>
+              <w:spacing w:after="0"/>
+              <w:jc w:val="center"/>
+            </w:pPr>
+            <w:r>
+              <w:rPr>
+                <w:rFonts w:ascii="Arial" w:hAnsi="Arial"/>
+                <w:b/>
+                <w:sz w:val="18"/>
+              </w:rPr>
+              <w:t>ASSOCIATIVE</w:t>
+            </w:r>
+          </w:p>
+          <w:p>
+            <w:pPr>
+              <w:spacing w:after="0"/>
+              <w:jc w:val="center"/>
+            </w:pPr>
+            <w:r>
+              <w:rPr>
+                <w:rFonts w:ascii="Arial" w:hAnsi="Arial"/>
+                <w:sz w:val="16"/>
+              </w:rPr>
+              <w:t>Recursive activation paths</w:t>
+            </w:r>
+          </w:p>
+        </w:tc>
+      </w:tr>
+    </w:tbl>
     <w:p>
       <w:pPr>
         <w:pStyle w:val="Caption"/>
@@ -1791,7 +2124,7 @@
         <w:jc w:val="center"/>
       </w:pPr>
       <w:r>
-        <w:t>Figure 1. Implemented architecture. PostgreSQL/PostGIS performs the central recall and strength computations.</w:t>
+        <w:t>Figure 1. Application requests flow to PostgreSQL; the database performs recall calculations.</w:t>
       </w:r>
     </w:p>
     <w:p>
@@ -1808,48 +2141,497 @@
         <w:t>The core schema separates reusable context labels from memory records. memory_contexts resolves the many-to-many relationship. memory_edges represents directed associations and permits explicit reciprocal edges. memory_reinforcements records each strength change. UUID primary keys, foreign keys, uniqueness rules, range checks, timestamp defaults, and targeted indexes protect the data contract. A nullable geography(Point,4326) column stores coordinates; timestamps use TIMESTAMPTZ, and occurred_at is kept distinct from last_strength_at.</w:t>
       </w:r>
     </w:p>
-    <w:p>
-      <w:pPr>
-        <w:keepNext/>
-        <w:keepLines/>
-        <w:spacing w:before="80" w:after="40"/>
+    <w:tbl>
+      <w:tblPr>
+        <w:tblStyle w:val="12"/>
+        <w:tblW w:type="auto" w:w="0"/>
         <w:jc w:val="center"/>
-      </w:pPr>
-      <w:r>
-        <w:drawing>
-          <wp:inline xmlns:a="http://schemas.openxmlformats.org/drawingml/2006/main">
-            <wp:extent cx="5257800" cy="3717447"/>
-            <wp:docPr id="2" name="Picture 2"/>
-            <wp:cNvGraphicFramePr>
-              <a:graphicFrameLocks noChangeAspect="1"/>
-            </wp:cNvGraphicFramePr>
-            <a:graphic>
-              <a:graphicData uri="http://schemas.openxmlformats.org/drawingml/2006/picture">
-                <pic:pic>
-                  <pic:nvPicPr>
-                    <pic:cNvPr id="0" name="data-model.png"/>
-                    <pic:cNvPicPr/>
-                  </pic:nvPicPr>
-                  <pic:blipFill>
-                    <a:blip r:embed="rId19"/>
-                    <a:stretch>
-                      <a:fillRect/>
-                    </a:stretch>
-                  </pic:blipFill>
-                  <pic:spPr>
-                    <a:xfrm>
-                      <a:off x="0" y="0"/>
-                      <a:ext cx="5257800" cy="3717447"/>
-                    </a:xfrm>
-                    <a:prstGeom prst="rect"/>
-                  </pic:spPr>
-                </pic:pic>
-              </a:graphicData>
-            </a:graphic>
-          </wp:inline>
-        </w:drawing>
-      </w:r>
-    </w:p>
+        <w:tblLayout w:type="fixed"/>
+        <w:tblLook w:firstColumn="1" w:firstRow="1" w:lastColumn="0" w:lastRow="0" w:noHBand="0" w:noVBand="1" w:val="04A0"/>
+      </w:tblPr>
+      <w:tblGrid>
+        <w:gridCol w:w="1909"/>
+        <w:gridCol w:w="1909"/>
+        <w:gridCol w:w="1909"/>
+        <w:gridCol w:w="1909"/>
+        <w:gridCol w:w="1909"/>
+      </w:tblGrid>
+      <w:tr>
+        <w:tc>
+          <w:tcPr>
+            <w:tcW w:type="dxa" w:w="1944"/>
+            <w:vAlign w:val="center"/>
+            <w:tcMar>
+              <w:top w:w="120" w:type="dxa"/>
+              <w:start w:w="90" w:type="dxa"/>
+              <w:bottom w:w="120" w:type="dxa"/>
+              <w:end w:w="90" w:type="dxa"/>
+            </w:tcMar>
+            <w:tcBorders>
+              <w:top w:val="single" w:sz="8" w:color="000000"/>
+              <w:left w:val="single" w:sz="8" w:color="000000"/>
+              <w:bottom w:val="single" w:sz="8" w:color="000000"/>
+              <w:right w:val="single" w:sz="8" w:color="000000"/>
+            </w:tcBorders>
+          </w:tcPr>
+          <w:p>
+            <w:pPr>
+              <w:spacing w:after="0"/>
+              <w:jc w:val="center"/>
+            </w:pPr>
+            <w:r>
+              <w:rPr>
+                <w:rFonts w:ascii="Arial" w:hAnsi="Arial"/>
+                <w:b/>
+                <w:sz w:val="18"/>
+              </w:rPr>
+              <w:t>MEMORIES</w:t>
+            </w:r>
+          </w:p>
+          <w:p>
+            <w:pPr>
+              <w:spacing w:after="0"/>
+              <w:jc w:val="center"/>
+            </w:pPr>
+            <w:r>
+              <w:rPr>
+                <w:rFonts w:ascii="Arial" w:hAnsi="Arial"/>
+                <w:sz w:val="16"/>
+              </w:rPr>
+              <w:t>id · title · occurred_at · location</w:t>
+            </w:r>
+          </w:p>
+        </w:tc>
+        <w:tc>
+          <w:tcPr>
+            <w:tcW w:type="dxa" w:w="1080"/>
+            <w:vAlign w:val="center"/>
+            <w:tcMar>
+              <w:top w:w="120" w:type="dxa"/>
+              <w:start w:w="90" w:type="dxa"/>
+              <w:bottom w:w="120" w:type="dxa"/>
+              <w:end w:w="90" w:type="dxa"/>
+            </w:tcMar>
+            <w:tcBorders>
+              <w:top w:val="nil"/>
+              <w:left w:val="nil"/>
+              <w:bottom w:val="nil"/>
+              <w:right w:val="nil"/>
+            </w:tcBorders>
+          </w:tcPr>
+          <w:p>
+            <w:pPr>
+              <w:spacing w:after="0"/>
+              <w:jc w:val="center"/>
+            </w:pPr>
+            <w:r>
+              <w:rPr>
+                <w:rFonts w:ascii="Arial" w:hAnsi="Arial"/>
+                <w:sz w:val="16"/>
+              </w:rPr>
+              <w:t>1 : N  →</w:t>
+            </w:r>
+          </w:p>
+        </w:tc>
+        <w:tc>
+          <w:tcPr>
+            <w:tcW w:type="dxa" w:w="2592"/>
+            <w:vAlign w:val="center"/>
+            <w:tcMar>
+              <w:top w:w="120" w:type="dxa"/>
+              <w:start w:w="90" w:type="dxa"/>
+              <w:bottom w:w="120" w:type="dxa"/>
+              <w:end w:w="90" w:type="dxa"/>
+            </w:tcMar>
+            <w:tcBorders>
+              <w:top w:val="single" w:sz="8" w:color="000000"/>
+              <w:left w:val="single" w:sz="8" w:color="000000"/>
+              <w:bottom w:val="single" w:sz="8" w:color="000000"/>
+              <w:right w:val="single" w:sz="8" w:color="000000"/>
+            </w:tcBorders>
+          </w:tcPr>
+          <w:p>
+            <w:pPr>
+              <w:spacing w:after="0"/>
+              <w:jc w:val="center"/>
+            </w:pPr>
+            <w:r>
+              <w:rPr>
+                <w:rFonts w:ascii="Arial" w:hAnsi="Arial"/>
+                <w:b/>
+                <w:sz w:val="16"/>
+              </w:rPr>
+              <w:t>MEMORY_CONTEXTS</w:t>
+            </w:r>
+          </w:p>
+          <w:p>
+            <w:pPr>
+              <w:spacing w:after="0"/>
+              <w:jc w:val="center"/>
+            </w:pPr>
+            <w:r>
+              <w:rPr>
+                <w:rFonts w:ascii="Arial" w:hAnsi="Arial"/>
+                <w:sz w:val="16"/>
+              </w:rPr>
+              <w:t>memory_id · context_id</w:t>
+            </w:r>
+          </w:p>
+        </w:tc>
+        <w:tc>
+          <w:tcPr>
+            <w:tcW w:type="dxa" w:w="1080"/>
+            <w:vAlign w:val="center"/>
+            <w:tcMar>
+              <w:top w:w="120" w:type="dxa"/>
+              <w:start w:w="90" w:type="dxa"/>
+              <w:bottom w:w="120" w:type="dxa"/>
+              <w:end w:w="90" w:type="dxa"/>
+            </w:tcMar>
+            <w:tcBorders>
+              <w:top w:val="nil"/>
+              <w:left w:val="nil"/>
+              <w:bottom w:val="nil"/>
+              <w:right w:val="nil"/>
+            </w:tcBorders>
+          </w:tcPr>
+          <w:p>
+            <w:pPr>
+              <w:spacing w:after="0"/>
+              <w:jc w:val="center"/>
+            </w:pPr>
+            <w:r>
+              <w:rPr>
+                <w:rFonts w:ascii="Arial" w:hAnsi="Arial"/>
+                <w:sz w:val="16"/>
+              </w:rPr>
+              <w:t>←  N : 1</w:t>
+            </w:r>
+          </w:p>
+        </w:tc>
+        <w:tc>
+          <w:tcPr>
+            <w:tcW w:type="dxa" w:w="1944"/>
+            <w:vAlign w:val="center"/>
+            <w:tcMar>
+              <w:top w:w="120" w:type="dxa"/>
+              <w:start w:w="90" w:type="dxa"/>
+              <w:bottom w:w="120" w:type="dxa"/>
+              <w:end w:w="90" w:type="dxa"/>
+            </w:tcMar>
+            <w:tcBorders>
+              <w:top w:val="single" w:sz="8" w:color="000000"/>
+              <w:left w:val="single" w:sz="8" w:color="000000"/>
+              <w:bottom w:val="single" w:sz="8" w:color="000000"/>
+              <w:right w:val="single" w:sz="8" w:color="000000"/>
+            </w:tcBorders>
+          </w:tcPr>
+          <w:p>
+            <w:pPr>
+              <w:spacing w:after="0"/>
+              <w:jc w:val="center"/>
+            </w:pPr>
+            <w:r>
+              <w:rPr>
+                <w:rFonts w:ascii="Arial" w:hAnsi="Arial"/>
+                <w:b/>
+                <w:sz w:val="18"/>
+              </w:rPr>
+              <w:t>CONTEXTS</w:t>
+            </w:r>
+          </w:p>
+          <w:p>
+            <w:pPr>
+              <w:spacing w:after="0"/>
+              <w:jc w:val="center"/>
+            </w:pPr>
+            <w:r>
+              <w:rPr>
+                <w:rFonts w:ascii="Arial" w:hAnsi="Arial"/>
+                <w:sz w:val="16"/>
+              </w:rPr>
+              <w:t>id · type · label</w:t>
+            </w:r>
+          </w:p>
+        </w:tc>
+      </w:tr>
+    </w:tbl>
+    <w:p/>
+    <w:tbl>
+      <w:tblPr>
+        <w:tblStyle w:val="12"/>
+        <w:tblW w:type="auto" w:w="0"/>
+        <w:jc w:val="center"/>
+        <w:tblLayout w:type="fixed"/>
+        <w:tblLook w:firstColumn="1" w:firstRow="1" w:lastColumn="0" w:lastRow="0" w:noHBand="0" w:noVBand="1" w:val="04A0"/>
+      </w:tblPr>
+      <w:tblGrid>
+        <w:gridCol w:w="3181"/>
+        <w:gridCol w:w="3181"/>
+        <w:gridCol w:w="3181"/>
+      </w:tblGrid>
+      <w:tr>
+        <w:tc>
+          <w:tcPr>
+            <w:tcW w:type="dxa" w:w="2592"/>
+            <w:vAlign w:val="center"/>
+            <w:tcMar>
+              <w:top w:w="120" w:type="dxa"/>
+              <w:start w:w="90" w:type="dxa"/>
+              <w:bottom w:w="120" w:type="dxa"/>
+              <w:end w:w="90" w:type="dxa"/>
+            </w:tcMar>
+            <w:tcBorders>
+              <w:top w:val="single" w:sz="8" w:color="000000"/>
+              <w:left w:val="single" w:sz="8" w:color="000000"/>
+              <w:bottom w:val="single" w:sz="8" w:color="000000"/>
+              <w:right w:val="single" w:sz="8" w:color="000000"/>
+            </w:tcBorders>
+          </w:tcPr>
+          <w:p>
+            <w:pPr>
+              <w:spacing w:after="0"/>
+              <w:jc w:val="center"/>
+            </w:pPr>
+            <w:r>
+              <w:rPr>
+                <w:rFonts w:ascii="Arial" w:hAnsi="Arial"/>
+                <w:b/>
+                <w:sz w:val="18"/>
+              </w:rPr>
+              <w:t>MEMORIES</w:t>
+            </w:r>
+          </w:p>
+          <w:p>
+            <w:pPr>
+              <w:spacing w:after="0"/>
+              <w:jc w:val="center"/>
+            </w:pPr>
+            <w:r>
+              <w:rPr>
+                <w:rFonts w:ascii="Arial" w:hAnsi="Arial"/>
+                <w:sz w:val="16"/>
+              </w:rPr>
+              <w:t>id · title</w:t>
+            </w:r>
+          </w:p>
+        </w:tc>
+        <w:tc>
+          <w:tcPr>
+            <w:tcW w:type="dxa" w:w="1152"/>
+            <w:vAlign w:val="center"/>
+            <w:tcMar>
+              <w:top w:w="120" w:type="dxa"/>
+              <w:start w:w="90" w:type="dxa"/>
+              <w:bottom w:w="120" w:type="dxa"/>
+              <w:end w:w="90" w:type="dxa"/>
+            </w:tcMar>
+            <w:tcBorders>
+              <w:top w:val="nil"/>
+              <w:left w:val="nil"/>
+              <w:bottom w:val="nil"/>
+              <w:right w:val="nil"/>
+            </w:tcBorders>
+          </w:tcPr>
+          <w:p>
+            <w:pPr>
+              <w:spacing w:after="0"/>
+              <w:jc w:val="center"/>
+            </w:pPr>
+            <w:r>
+              <w:rPr>
+                <w:rFonts w:ascii="Arial" w:hAnsi="Arial"/>
+                <w:sz w:val="16"/>
+              </w:rPr>
+              <w:t>1 : N  →</w:t>
+            </w:r>
+          </w:p>
+        </w:tc>
+        <w:tc>
+          <w:tcPr>
+            <w:tcW w:type="dxa" w:w="4032"/>
+            <w:vAlign w:val="center"/>
+            <w:tcMar>
+              <w:top w:w="120" w:type="dxa"/>
+              <w:start w:w="90" w:type="dxa"/>
+              <w:bottom w:w="120" w:type="dxa"/>
+              <w:end w:w="90" w:type="dxa"/>
+            </w:tcMar>
+            <w:tcBorders>
+              <w:top w:val="single" w:sz="8" w:color="000000"/>
+              <w:left w:val="single" w:sz="8" w:color="000000"/>
+              <w:bottom w:val="single" w:sz="8" w:color="000000"/>
+              <w:right w:val="single" w:sz="8" w:color="000000"/>
+            </w:tcBorders>
+          </w:tcPr>
+          <w:p>
+            <w:pPr>
+              <w:spacing w:after="0"/>
+              <w:jc w:val="center"/>
+            </w:pPr>
+            <w:r>
+              <w:rPr>
+                <w:rFonts w:ascii="Arial" w:hAnsi="Arial"/>
+                <w:b/>
+                <w:sz w:val="18"/>
+              </w:rPr>
+              <w:t>MEMORY_EDGES</w:t>
+            </w:r>
+          </w:p>
+          <w:p>
+            <w:pPr>
+              <w:spacing w:after="0"/>
+              <w:jc w:val="center"/>
+            </w:pPr>
+            <w:r>
+              <w:rPr>
+                <w:rFonts w:ascii="Arial" w:hAnsi="Arial"/>
+                <w:sz w:val="16"/>
+              </w:rPr>
+              <w:t>src · dst reference memories</w:t>
+            </w:r>
+          </w:p>
+        </w:tc>
+      </w:tr>
+    </w:tbl>
+    <w:p/>
+    <w:tbl>
+      <w:tblPr>
+        <w:tblStyle w:val="12"/>
+        <w:tblW w:type="auto" w:w="0"/>
+        <w:jc w:val="center"/>
+        <w:tblLayout w:type="fixed"/>
+        <w:tblLook w:firstColumn="1" w:firstRow="1" w:lastColumn="0" w:lastRow="0" w:noHBand="0" w:noVBand="1" w:val="04A0"/>
+      </w:tblPr>
+      <w:tblGrid>
+        <w:gridCol w:w="3181"/>
+        <w:gridCol w:w="3181"/>
+        <w:gridCol w:w="3181"/>
+      </w:tblGrid>
+      <w:tr>
+        <w:tc>
+          <w:tcPr>
+            <w:tcW w:type="dxa" w:w="2592"/>
+            <w:vAlign w:val="center"/>
+            <w:tcMar>
+              <w:top w:w="120" w:type="dxa"/>
+              <w:start w:w="90" w:type="dxa"/>
+              <w:bottom w:w="120" w:type="dxa"/>
+              <w:end w:w="90" w:type="dxa"/>
+            </w:tcMar>
+            <w:tcBorders>
+              <w:top w:val="single" w:sz="8" w:color="000000"/>
+              <w:left w:val="single" w:sz="8" w:color="000000"/>
+              <w:bottom w:val="single" w:sz="8" w:color="000000"/>
+              <w:right w:val="single" w:sz="8" w:color="000000"/>
+            </w:tcBorders>
+          </w:tcPr>
+          <w:p>
+            <w:pPr>
+              <w:spacing w:after="0"/>
+              <w:jc w:val="center"/>
+            </w:pPr>
+            <w:r>
+              <w:rPr>
+                <w:rFonts w:ascii="Arial" w:hAnsi="Arial"/>
+                <w:b/>
+                <w:sz w:val="18"/>
+              </w:rPr>
+              <w:t>MEMORIES</w:t>
+            </w:r>
+          </w:p>
+          <w:p>
+            <w:pPr>
+              <w:spacing w:after="0"/>
+              <w:jc w:val="center"/>
+            </w:pPr>
+            <w:r>
+              <w:rPr>
+                <w:rFonts w:ascii="Arial" w:hAnsi="Arial"/>
+                <w:sz w:val="16"/>
+              </w:rPr>
+              <w:t>id · title</w:t>
+            </w:r>
+          </w:p>
+        </w:tc>
+        <w:tc>
+          <w:tcPr>
+            <w:tcW w:type="dxa" w:w="1152"/>
+            <w:vAlign w:val="center"/>
+            <w:tcMar>
+              <w:top w:w="120" w:type="dxa"/>
+              <w:start w:w="90" w:type="dxa"/>
+              <w:bottom w:w="120" w:type="dxa"/>
+              <w:end w:w="90" w:type="dxa"/>
+            </w:tcMar>
+            <w:tcBorders>
+              <w:top w:val="nil"/>
+              <w:left w:val="nil"/>
+              <w:bottom w:val="nil"/>
+              <w:right w:val="nil"/>
+            </w:tcBorders>
+          </w:tcPr>
+          <w:p>
+            <w:pPr>
+              <w:spacing w:after="0"/>
+              <w:jc w:val="center"/>
+            </w:pPr>
+            <w:r>
+              <w:rPr>
+                <w:rFonts w:ascii="Arial" w:hAnsi="Arial"/>
+                <w:sz w:val="16"/>
+              </w:rPr>
+              <w:t>1 : N  →</w:t>
+            </w:r>
+          </w:p>
+        </w:tc>
+        <w:tc>
+          <w:tcPr>
+            <w:tcW w:type="dxa" w:w="4032"/>
+            <w:vAlign w:val="center"/>
+            <w:tcMar>
+              <w:top w:w="120" w:type="dxa"/>
+              <w:start w:w="90" w:type="dxa"/>
+              <w:bottom w:w="120" w:type="dxa"/>
+              <w:end w:w="90" w:type="dxa"/>
+            </w:tcMar>
+            <w:tcBorders>
+              <w:top w:val="single" w:sz="8" w:color="000000"/>
+              <w:left w:val="single" w:sz="8" w:color="000000"/>
+              <w:bottom w:val="single" w:sz="8" w:color="000000"/>
+              <w:right w:val="single" w:sz="8" w:color="000000"/>
+            </w:tcBorders>
+          </w:tcPr>
+          <w:p>
+            <w:pPr>
+              <w:spacing w:after="0"/>
+              <w:jc w:val="center"/>
+            </w:pPr>
+            <w:r>
+              <w:rPr>
+                <w:rFonts w:ascii="Arial" w:hAnsi="Arial"/>
+                <w:b/>
+                <w:sz w:val="16"/>
+              </w:rPr>
+              <w:t>REINFORCEMENTS</w:t>
+            </w:r>
+          </w:p>
+          <w:p>
+            <w:pPr>
+              <w:spacing w:after="0"/>
+              <w:jc w:val="center"/>
+            </w:pPr>
+            <w:r>
+              <w:rPr>
+                <w:rFonts w:ascii="Arial" w:hAnsi="Arial"/>
+                <w:sz w:val="16"/>
+              </w:rPr>
+              <w:t>memory_id · strength history</w:t>
+            </w:r>
+          </w:p>
+        </w:tc>
+      </w:tr>
+    </w:tbl>
     <w:p>
       <w:pPr>
         <w:pStyle w:val="Caption"/>
@@ -1857,7 +2639,7 @@
         <w:jc w:val="center"/>
       </w:pPr>
       <w:r>
-        <w:t>Figure 2. Core entities and cardinalities. Edge source and destination are two foreign keys back to memories.</w:t>
+        <w:t>Figure 2. Context links, directed memory edges, and reinforcement history are represented with foreign keys.</w:t>
       </w:r>
     </w:p>
     <w:p>
@@ -2704,58 +3486,6 @@
     <w:p>
       <w:r>
         <w:t>The scale comparison runs five sequential trials for each synthetic size (10,000 and 50,000 memories). Each observation follows a PostgreSQL restart, which resets shared_buffers, but the protocol does not flush operating-system cache. Data is generated from clustered campus distributions. Values below are observed medians from this host and this workload; they are not cold-disk latency, an independent-machine sample, or a general service-level expectation. [14–16]</w:t>
-      </w:r>
-    </w:p>
-    <w:p>
-      <w:pPr>
-        <w:keepNext/>
-        <w:keepLines/>
-        <w:spacing w:before="80" w:after="40"/>
-        <w:jc w:val="center"/>
-      </w:pPr>
-      <w:r>
-        <w:drawing>
-          <wp:inline xmlns:a="http://schemas.openxmlformats.org/drawingml/2006/main">
-            <wp:extent cx="5989320" cy="4234657"/>
-            <wp:docPr id="3" name="Picture 3"/>
-            <wp:cNvGraphicFramePr>
-              <a:graphicFrameLocks noChangeAspect="1"/>
-            </wp:cNvGraphicFramePr>
-            <a:graphic>
-              <a:graphicData uri="http://schemas.openxmlformats.org/drawingml/2006/picture">
-                <pic:pic>
-                  <pic:nvPicPr>
-                    <pic:cNvPr id="0" name="benchmark-medians.png"/>
-                    <pic:cNvPicPr/>
-                  </pic:nvPicPr>
-                  <pic:blipFill>
-                    <a:blip r:embed="rId20"/>
-                    <a:stretch>
-                      <a:fillRect/>
-                    </a:stretch>
-                  </pic:blipFill>
-                  <pic:spPr>
-                    <a:xfrm>
-                      <a:off x="0" y="0"/>
-                      <a:ext cx="5989320" cy="4234657"/>
-                    </a:xfrm>
-                    <a:prstGeom prst="rect"/>
-                  </pic:spPr>
-                </pic:pic>
-              </a:graphicData>
-            </a:graphic>
-          </wp:inline>
-        </w:drawing>
-      </w:r>
-    </w:p>
-    <w:p>
-      <w:pPr>
-        <w:pStyle w:val="Caption"/>
-        <w:keepLines/>
-        <w:jc w:val="center"/>
-      </w:pPr>
-      <w:r>
-        <w:t>Figure 3. Median execution time from five restart-only trials; exact values and caveats are also listed in Table 3.</w:t>
       </w:r>
     </w:p>
     <w:tbl>
@@ -3857,7 +4587,7 @@
         </w:rPr>
         <w:t xml:space="preserve">[1] Tulving, E. (2002). Episodic memory: From mind to brain. Annual Review of Psychology, 53, 1–25. DOI: 10.1146/annurev.psych.53.100901.135114. </w:t>
       </w:r>
-      <w:hyperlink r:id="rId21">
+      <w:hyperlink r:id="rId18">
         <w:r>
           <w:rPr>
             <w:color w:val="000000"/>
@@ -3879,7 +4609,7 @@
         </w:rPr>
         <w:t xml:space="preserve">[2] Tulving, E., &amp; Thomson, D. M. (1973). Encoding specificity and retrieval processes in episodic memory. Psychological Review, 80(5), 352–373. DOI: 10.1037/h0020071. </w:t>
       </w:r>
-      <w:hyperlink r:id="rId22">
+      <w:hyperlink r:id="rId19">
         <w:r>
           <w:rPr>
             <w:color w:val="000000"/>
@@ -3901,7 +4631,7 @@
         </w:rPr>
         <w:t xml:space="preserve">[3] Tolman, E. C. (1948). Cognitive maps in rats and men. Psychological Review, 55(4), 189–208. DOI: 10.1037/h0061626. </w:t>
       </w:r>
-      <w:hyperlink r:id="rId23">
+      <w:hyperlink r:id="rId20">
         <w:r>
           <w:rPr>
             <w:color w:val="000000"/>
@@ -3923,7 +4653,7 @@
         </w:rPr>
         <w:t xml:space="preserve">[4] Conway, M. A., &amp; Pleydell-Pearce, C. W. (2000). The construction of autobiographical memories in the self-memory system. Psychological Review, 107(2), 261–288. DOI: 10.1037/0033-295X.107.2.261. </w:t>
       </w:r>
-      <w:hyperlink r:id="rId24">
+      <w:hyperlink r:id="rId21">
         <w:r>
           <w:rPr>
             <w:color w:val="000000"/>
@@ -3945,7 +4675,7 @@
         </w:rPr>
         <w:t xml:space="preserve">[5] Howard, M. W., &amp; Kahana, M. J. (2002). A distributed representation of temporal context. Journal of Mathematical Psychology, 46(3), 269–299. DOI: 10.1006/jmps.2001.1388. </w:t>
       </w:r>
-      <w:hyperlink r:id="rId25">
+      <w:hyperlink r:id="rId22">
         <w:r>
           <w:rPr>
             <w:color w:val="000000"/>
@@ -3967,7 +4697,7 @@
         </w:rPr>
         <w:t xml:space="preserve">[6] Collins, A. M., &amp; Loftus, E. F. (1975). A spreading-activation theory of semantic processing. Psychological Review, 82(6), 407–428. DOI: 10.1037/0033-295X.82.6.407. </w:t>
       </w:r>
-      <w:hyperlink r:id="rId26">
+      <w:hyperlink r:id="rId23">
         <w:r>
           <w:rPr>
             <w:color w:val="000000"/>
@@ -3989,7 +4719,7 @@
         </w:rPr>
         <w:t xml:space="preserve">[7] Ebbinghaus, H. (1913). Memory: A contribution to experimental psychology (H. A. Ruger &amp; C. E. Bussenius, Trans.). Teachers College, Columbia University. (Original work published 1885). </w:t>
       </w:r>
-      <w:hyperlink r:id="rId27">
+      <w:hyperlink r:id="rId24">
         <w:r>
           <w:rPr>
             <w:color w:val="000000"/>
@@ -4011,7 +4741,7 @@
         </w:rPr>
         <w:t xml:space="preserve">[8] Wixted, J. T., &amp; Ebbesen, E. B. (1991). On the form of forgetting. Psychological Science, 2(6), 409–415. DOI: 10.1111/j.1467-9280.1991.tb00175.x. </w:t>
       </w:r>
-      <w:hyperlink r:id="rId28">
+      <w:hyperlink r:id="rId25">
         <w:r>
           <w:rPr>
             <w:color w:val="000000"/>
@@ -4033,7 +4763,7 @@
         </w:rPr>
         <w:t xml:space="preserve">[9] Sellen, A., &amp; Whittaker, S. (2010). Beyond total capture: A constructive critique of lifelogging. Communications of the ACM, 53(5), 70–77. DOI: 10.1145/1735223.1735243. </w:t>
       </w:r>
-      <w:hyperlink r:id="rId29">
+      <w:hyperlink r:id="rId26">
         <w:r>
           <w:rPr>
             <w:color w:val="000000"/>
@@ -4055,7 +4785,7 @@
         </w:rPr>
         <w:t xml:space="preserve">[10] Elsweiler, D., Ruthven, I., &amp; Jones, C. (2007). Towards memory-supporting personal information management tools. Journal of the American Society for Information Science and Technology, 58(7), 924–946. DOI: 10.1002/asi.20570. </w:t>
       </w:r>
-      <w:hyperlink r:id="rId30">
+      <w:hyperlink r:id="rId27">
         <w:r>
           <w:rPr>
             <w:color w:val="000000"/>
@@ -4077,7 +4807,7 @@
         </w:rPr>
         <w:t xml:space="preserve">[11] Thudt, A., Baur, D., &amp; Carpendale, S. (2013). Visits: A spatiotemporal visualization of location histories. EuroVis Short Papers, 79–83. DOI: 10.2312/PE.EuroVisShort.EuroVisShort2013.079-083. </w:t>
       </w:r>
-      <w:hyperlink r:id="rId31">
+      <w:hyperlink r:id="rId28">
         <w:r>
           <w:rPr>
             <w:color w:val="000000"/>
@@ -4099,7 +4829,7 @@
         </w:rPr>
         <w:t xml:space="preserve">[12] Ribeiro, R., Trifan, A., &amp; Neves, A. J. R. (2022). Lifelog retrieval from daily digital data: Narrative review. JMIR mHealth and uHealth, 10(5), e30517. DOI: 10.2196/30517. </w:t>
       </w:r>
-      <w:hyperlink r:id="rId32">
+      <w:hyperlink r:id="rId29">
         <w:r>
           <w:rPr>
             <w:color w:val="000000"/>
@@ -4121,7 +4851,7 @@
         </w:rPr>
         <w:t xml:space="preserve">[13] Duane, A., Jónsson, B. Þ., Lee, H., &amp; Gurrin, C. (2023). LAD: An application design model to support the analysis of large-scale personal data collections generated by lifelogging. Personal and Ubiquitous Computing, 27, 2133–2145. DOI: 10.1007/s00779-023-01726-z. </w:t>
       </w:r>
-      <w:hyperlink r:id="rId33">
+      <w:hyperlink r:id="rId30">
         <w:r>
           <w:rPr>
             <w:color w:val="000000"/>
@@ -4143,7 +4873,7 @@
         </w:rPr>
         <w:t xml:space="preserve">[14] PostgreSQL Global Development Group. (2026). PostgreSQL 16 documentation: Recursive WITH queries, indexes and index types, transaction isolation, and materialized views. </w:t>
       </w:r>
-      <w:hyperlink r:id="rId34">
+      <w:hyperlink r:id="rId31">
         <w:r>
           <w:rPr>
             <w:color w:val="000000"/>
@@ -4155,7 +4885,7 @@
       <w:r>
         <w:t xml:space="preserve"> </w:t>
       </w:r>
-      <w:hyperlink r:id="rId35">
+      <w:hyperlink r:id="rId32">
         <w:r>
           <w:rPr>
             <w:color w:val="000000"/>
@@ -4167,7 +4897,7 @@
       <w:r>
         <w:t xml:space="preserve"> </w:t>
       </w:r>
-      <w:hyperlink r:id="rId36">
+      <w:hyperlink r:id="rId33">
         <w:r>
           <w:rPr>
             <w:color w:val="000000"/>
@@ -4179,7 +4909,7 @@
       <w:r>
         <w:t xml:space="preserve"> </w:t>
       </w:r>
-      <w:hyperlink r:id="rId37">
+      <w:hyperlink r:id="rId34">
         <w:r>
           <w:rPr>
             <w:color w:val="000000"/>
@@ -4204,7 +4934,7 @@
         </w:rPr>
         <w:t xml:space="preserve">[15] PostGIS Project Steering Committee. (2026). PostGIS reference: ST_DWithin and ST_LineLocatePoint. </w:t>
       </w:r>
-      <w:hyperlink r:id="rId38">
+      <w:hyperlink r:id="rId35">
         <w:r>
           <w:rPr>
             <w:color w:val="000000"/>
@@ -4216,7 +4946,7 @@
       <w:r>
         <w:t xml:space="preserve"> </w:t>
       </w:r>
-      <w:hyperlink r:id="rId39">
+      <w:hyperlink r:id="rId36">
         <w:r>
           <w:rPr>
             <w:color w:val="000000"/>
@@ -4241,7 +4971,7 @@
         </w:rPr>
         <w:t xml:space="preserve">[16] Citus Data. (2026). pg_cron: Run periodic jobs in PostgreSQL. GitHub project documentation. </w:t>
       </w:r>
-      <w:hyperlink r:id="rId40">
+      <w:hyperlink r:id="rId37">
         <w:r>
           <w:rPr>
             <w:color w:val="000000"/>

</xml_diff>